<commit_message>
Se marco como completado en la matriz los modelos fisicos de los RF-8 Y RF-9 del MODULO 1 (Gestion de Ubicaciones)
</commit_message>
<xml_diff>
--- a/Docs/Matriz de trazabilidad.docx
+++ b/Docs/Matriz de trazabilidad.docx
@@ -668,53 +668,54 @@
               <w:bottom w:color="c4c7c5" w:space="0" w:sz="6" w:val="single"/>
               <w:right w:color="c4c7c5" w:space="0" w:sz="6" w:val="single"/>
             </w:tcBorders>
-            <w:shd w:fill="ffd966" w:val="clear"/>
-            <w:tcMar>
-              <w:top w:w="120.0" w:type="dxa"/>
-              <w:left w:w="180.0" w:type="dxa"/>
-              <w:bottom w:w="120.0" w:type="dxa"/>
-              <w:right w:w="180.0" w:type="dxa"/>
-            </w:tcMar>
-            <w:vAlign w:val="top"/>
-          </w:tcPr>
-          <w:p>
-            <w:pPr>
-              <w:spacing w:line="240" w:lineRule="auto"/>
-              <w:rPr/>
-            </w:pPr>
-            <w:r>
-              <w:rPr>
-                <w:rtl w:val="0"/>
-              </w:rPr>
-              <w:t xml:space="preserve">Pendiente</w:t>
-            </w:r>
-          </w:p>
-        </w:tc>
-        <w:tc>
-          <w:tcPr>
-            <w:tcBorders>
-              <w:top w:color="c4c7c5" w:space="0" w:sz="6" w:val="single"/>
-              <w:left w:color="c4c7c5" w:space="0" w:sz="6" w:val="single"/>
-              <w:bottom w:color="c4c7c5" w:space="0" w:sz="6" w:val="single"/>
-              <w:right w:color="c4c7c5" w:space="0" w:sz="6" w:val="single"/>
-            </w:tcBorders>
-            <w:tcMar>
-              <w:top w:w="120.0" w:type="dxa"/>
-              <w:left w:w="180.0" w:type="dxa"/>
-              <w:bottom w:w="120.0" w:type="dxa"/>
-              <w:right w:w="180.0" w:type="dxa"/>
-            </w:tcMar>
-            <w:vAlign w:val="top"/>
-          </w:tcPr>
-          <w:p>
-            <w:pPr>
-              <w:spacing w:line="240" w:lineRule="auto"/>
-              <w:rPr/>
-            </w:pPr>
-            <w:r>
-              <w:rPr>
-                <w:rtl w:val="0"/>
-              </w:rPr>
+            <w:shd w:fill="93c47d" w:val="clear"/>
+            <w:tcMar>
+              <w:top w:w="120.0" w:type="dxa"/>
+              <w:left w:w="180.0" w:type="dxa"/>
+              <w:bottom w:w="120.0" w:type="dxa"/>
+              <w:right w:w="180.0" w:type="dxa"/>
+            </w:tcMar>
+            <w:vAlign w:val="top"/>
+          </w:tcPr>
+          <w:p>
+            <w:pPr>
+              <w:spacing w:line="240" w:lineRule="auto"/>
+              <w:rPr/>
+            </w:pPr>
+            <w:r>
+              <w:rPr>
+                <w:rtl w:val="0"/>
+              </w:rPr>
+              <w:t xml:space="preserve">Completado</w:t>
+            </w:r>
+          </w:p>
+        </w:tc>
+        <w:tc>
+          <w:tcPr>
+            <w:tcBorders>
+              <w:top w:color="c4c7c5" w:space="0" w:sz="6" w:val="single"/>
+              <w:left w:color="c4c7c5" w:space="0" w:sz="6" w:val="single"/>
+              <w:bottom w:color="c4c7c5" w:space="0" w:sz="6" w:val="single"/>
+              <w:right w:color="c4c7c5" w:space="0" w:sz="6" w:val="single"/>
+            </w:tcBorders>
+            <w:tcMar>
+              <w:top w:w="120.0" w:type="dxa"/>
+              <w:left w:w="180.0" w:type="dxa"/>
+              <w:bottom w:w="120.0" w:type="dxa"/>
+              <w:right w:w="180.0" w:type="dxa"/>
+            </w:tcMar>
+            <w:vAlign w:val="top"/>
+          </w:tcPr>
+          <w:p>
+            <w:pPr>
+              <w:spacing w:line="240" w:lineRule="auto"/>
+              <w:rPr/>
+            </w:pPr>
+            <w:r>
+              <w:rPr>
+                <w:rtl w:val="0"/>
+              </w:rPr>
+              <w:t xml:space="preserve">13-9-2026</w:t>
             </w:r>
           </w:p>
         </w:tc>
@@ -1146,53 +1147,54 @@
               <w:bottom w:color="c4c7c5" w:space="0" w:sz="6" w:val="single"/>
               <w:right w:color="c4c7c5" w:space="0" w:sz="6" w:val="single"/>
             </w:tcBorders>
-            <w:shd w:fill="ffd966" w:val="clear"/>
-            <w:tcMar>
-              <w:top w:w="120.0" w:type="dxa"/>
-              <w:left w:w="180.0" w:type="dxa"/>
-              <w:bottom w:w="120.0" w:type="dxa"/>
-              <w:right w:w="180.0" w:type="dxa"/>
-            </w:tcMar>
-            <w:vAlign w:val="top"/>
-          </w:tcPr>
-          <w:p>
-            <w:pPr>
-              <w:spacing w:line="240" w:lineRule="auto"/>
-              <w:rPr/>
-            </w:pPr>
-            <w:r>
-              <w:rPr>
-                <w:rtl w:val="0"/>
-              </w:rPr>
-              <w:t xml:space="preserve">Pendiente</w:t>
-            </w:r>
-          </w:p>
-        </w:tc>
-        <w:tc>
-          <w:tcPr>
-            <w:tcBorders>
-              <w:top w:color="c4c7c5" w:space="0" w:sz="6" w:val="single"/>
-              <w:left w:color="c4c7c5" w:space="0" w:sz="6" w:val="single"/>
-              <w:bottom w:color="c4c7c5" w:space="0" w:sz="6" w:val="single"/>
-              <w:right w:color="c4c7c5" w:space="0" w:sz="6" w:val="single"/>
-            </w:tcBorders>
-            <w:tcMar>
-              <w:top w:w="120.0" w:type="dxa"/>
-              <w:left w:w="180.0" w:type="dxa"/>
-              <w:bottom w:w="120.0" w:type="dxa"/>
-              <w:right w:w="180.0" w:type="dxa"/>
-            </w:tcMar>
-            <w:vAlign w:val="top"/>
-          </w:tcPr>
-          <w:p>
-            <w:pPr>
-              <w:spacing w:line="240" w:lineRule="auto"/>
-              <w:rPr/>
-            </w:pPr>
-            <w:r>
-              <w:rPr>
-                <w:rtl w:val="0"/>
-              </w:rPr>
+            <w:shd w:fill="93c47d" w:val="clear"/>
+            <w:tcMar>
+              <w:top w:w="120.0" w:type="dxa"/>
+              <w:left w:w="180.0" w:type="dxa"/>
+              <w:bottom w:w="120.0" w:type="dxa"/>
+              <w:right w:w="180.0" w:type="dxa"/>
+            </w:tcMar>
+            <w:vAlign w:val="top"/>
+          </w:tcPr>
+          <w:p>
+            <w:pPr>
+              <w:spacing w:line="240" w:lineRule="auto"/>
+              <w:rPr/>
+            </w:pPr>
+            <w:r>
+              <w:rPr>
+                <w:rtl w:val="0"/>
+              </w:rPr>
+              <w:t xml:space="preserve">Completado</w:t>
+            </w:r>
+          </w:p>
+        </w:tc>
+        <w:tc>
+          <w:tcPr>
+            <w:tcBorders>
+              <w:top w:color="c4c7c5" w:space="0" w:sz="6" w:val="single"/>
+              <w:left w:color="c4c7c5" w:space="0" w:sz="6" w:val="single"/>
+              <w:bottom w:color="c4c7c5" w:space="0" w:sz="6" w:val="single"/>
+              <w:right w:color="c4c7c5" w:space="0" w:sz="6" w:val="single"/>
+            </w:tcBorders>
+            <w:tcMar>
+              <w:top w:w="120.0" w:type="dxa"/>
+              <w:left w:w="180.0" w:type="dxa"/>
+              <w:bottom w:w="120.0" w:type="dxa"/>
+              <w:right w:w="180.0" w:type="dxa"/>
+            </w:tcMar>
+            <w:vAlign w:val="top"/>
+          </w:tcPr>
+          <w:p>
+            <w:pPr>
+              <w:spacing w:line="240" w:lineRule="auto"/>
+              <w:rPr/>
+            </w:pPr>
+            <w:r>
+              <w:rPr>
+                <w:rtl w:val="0"/>
+              </w:rPr>
+              <w:t xml:space="preserve">13-9-2026</w:t>
             </w:r>
           </w:p>
         </w:tc>
@@ -1297,53 +1299,54 @@
               <w:bottom w:color="c4c7c5" w:space="0" w:sz="6" w:val="single"/>
               <w:right w:color="c4c7c5" w:space="0" w:sz="6" w:val="single"/>
             </w:tcBorders>
-            <w:shd w:fill="ffd966" w:val="clear"/>
-            <w:tcMar>
-              <w:top w:w="120.0" w:type="dxa"/>
-              <w:left w:w="180.0" w:type="dxa"/>
-              <w:bottom w:w="120.0" w:type="dxa"/>
-              <w:right w:w="180.0" w:type="dxa"/>
-            </w:tcMar>
-            <w:vAlign w:val="top"/>
-          </w:tcPr>
-          <w:p>
-            <w:pPr>
-              <w:spacing w:line="240" w:lineRule="auto"/>
-              <w:rPr/>
-            </w:pPr>
-            <w:r>
-              <w:rPr>
-                <w:rtl w:val="0"/>
-              </w:rPr>
-              <w:t xml:space="preserve">Pendiente</w:t>
-            </w:r>
-          </w:p>
-        </w:tc>
-        <w:tc>
-          <w:tcPr>
-            <w:tcBorders>
-              <w:top w:color="c4c7c5" w:space="0" w:sz="6" w:val="single"/>
-              <w:left w:color="c4c7c5" w:space="0" w:sz="6" w:val="single"/>
-              <w:bottom w:color="c4c7c5" w:space="0" w:sz="6" w:val="single"/>
-              <w:right w:color="c4c7c5" w:space="0" w:sz="6" w:val="single"/>
-            </w:tcBorders>
-            <w:tcMar>
-              <w:top w:w="120.0" w:type="dxa"/>
-              <w:left w:w="180.0" w:type="dxa"/>
-              <w:bottom w:w="120.0" w:type="dxa"/>
-              <w:right w:w="180.0" w:type="dxa"/>
-            </w:tcMar>
-            <w:vAlign w:val="top"/>
-          </w:tcPr>
-          <w:p>
-            <w:pPr>
-              <w:spacing w:line="240" w:lineRule="auto"/>
-              <w:rPr/>
-            </w:pPr>
-            <w:r>
-              <w:rPr>
-                <w:rtl w:val="0"/>
-              </w:rPr>
+            <w:shd w:fill="93c47d" w:val="clear"/>
+            <w:tcMar>
+              <w:top w:w="120.0" w:type="dxa"/>
+              <w:left w:w="180.0" w:type="dxa"/>
+              <w:bottom w:w="120.0" w:type="dxa"/>
+              <w:right w:w="180.0" w:type="dxa"/>
+            </w:tcMar>
+            <w:vAlign w:val="top"/>
+          </w:tcPr>
+          <w:p>
+            <w:pPr>
+              <w:spacing w:line="240" w:lineRule="auto"/>
+              <w:rPr/>
+            </w:pPr>
+            <w:r>
+              <w:rPr>
+                <w:rtl w:val="0"/>
+              </w:rPr>
+              <w:t xml:space="preserve">Completado</w:t>
+            </w:r>
+          </w:p>
+        </w:tc>
+        <w:tc>
+          <w:tcPr>
+            <w:tcBorders>
+              <w:top w:color="c4c7c5" w:space="0" w:sz="6" w:val="single"/>
+              <w:left w:color="c4c7c5" w:space="0" w:sz="6" w:val="single"/>
+              <w:bottom w:color="c4c7c5" w:space="0" w:sz="6" w:val="single"/>
+              <w:right w:color="c4c7c5" w:space="0" w:sz="6" w:val="single"/>
+            </w:tcBorders>
+            <w:tcMar>
+              <w:top w:w="120.0" w:type="dxa"/>
+              <w:left w:w="180.0" w:type="dxa"/>
+              <w:bottom w:w="120.0" w:type="dxa"/>
+              <w:right w:w="180.0" w:type="dxa"/>
+            </w:tcMar>
+            <w:vAlign w:val="top"/>
+          </w:tcPr>
+          <w:p>
+            <w:pPr>
+              <w:spacing w:line="240" w:lineRule="auto"/>
+              <w:rPr/>
+            </w:pPr>
+            <w:r>
+              <w:rPr>
+                <w:rtl w:val="0"/>
+              </w:rPr>
+              <w:t xml:space="preserve">13-9-2026</w:t>
             </w:r>
           </w:p>
         </w:tc>

</xml_diff>

<commit_message>
Se finalizó el modelo conceptual del MODULO 2 (Tareas asociadas a eventos)
</commit_message>
<xml_diff>
--- a/Docs/Matriz de trazabilidad.docx
+++ b/Docs/Matriz de trazabilidad.docx
@@ -1625,53 +1625,54 @@
               <w:bottom w:color="c4c7c5" w:space="0" w:sz="6" w:val="single"/>
               <w:right w:color="c4c7c5" w:space="0" w:sz="6" w:val="single"/>
             </w:tcBorders>
-            <w:shd w:fill="ffd966" w:val="clear"/>
-            <w:tcMar>
-              <w:top w:w="120.0" w:type="dxa"/>
-              <w:left w:w="180.0" w:type="dxa"/>
-              <w:bottom w:w="120.0" w:type="dxa"/>
-              <w:right w:w="180.0" w:type="dxa"/>
-            </w:tcMar>
-            <w:vAlign w:val="top"/>
-          </w:tcPr>
-          <w:p>
-            <w:pPr>
-              <w:spacing w:line="240" w:lineRule="auto"/>
-              <w:rPr/>
-            </w:pPr>
-            <w:r>
-              <w:rPr>
-                <w:rtl w:val="0"/>
-              </w:rPr>
-              <w:t xml:space="preserve">Pendiente</w:t>
-            </w:r>
-          </w:p>
-        </w:tc>
-        <w:tc>
-          <w:tcPr>
-            <w:tcBorders>
-              <w:top w:color="c4c7c5" w:space="0" w:sz="6" w:val="single"/>
-              <w:left w:color="c4c7c5" w:space="0" w:sz="6" w:val="single"/>
-              <w:bottom w:color="c4c7c5" w:space="0" w:sz="6" w:val="single"/>
-              <w:right w:color="c4c7c5" w:space="0" w:sz="6" w:val="single"/>
-            </w:tcBorders>
-            <w:tcMar>
-              <w:top w:w="120.0" w:type="dxa"/>
-              <w:left w:w="180.0" w:type="dxa"/>
-              <w:bottom w:w="120.0" w:type="dxa"/>
-              <w:right w:w="180.0" w:type="dxa"/>
-            </w:tcMar>
-            <w:vAlign w:val="top"/>
-          </w:tcPr>
-          <w:p>
-            <w:pPr>
-              <w:spacing w:line="240" w:lineRule="auto"/>
-              <w:rPr/>
-            </w:pPr>
-            <w:r>
-              <w:rPr>
-                <w:rtl w:val="0"/>
-              </w:rPr>
+            <w:shd w:fill="93c47d" w:val="clear"/>
+            <w:tcMar>
+              <w:top w:w="120.0" w:type="dxa"/>
+              <w:left w:w="180.0" w:type="dxa"/>
+              <w:bottom w:w="120.0" w:type="dxa"/>
+              <w:right w:w="180.0" w:type="dxa"/>
+            </w:tcMar>
+            <w:vAlign w:val="top"/>
+          </w:tcPr>
+          <w:p>
+            <w:pPr>
+              <w:spacing w:line="240" w:lineRule="auto"/>
+              <w:rPr/>
+            </w:pPr>
+            <w:r>
+              <w:rPr>
+                <w:rtl w:val="0"/>
+              </w:rPr>
+              <w:t xml:space="preserve">Completado</w:t>
+            </w:r>
+          </w:p>
+        </w:tc>
+        <w:tc>
+          <w:tcPr>
+            <w:tcBorders>
+              <w:top w:color="c4c7c5" w:space="0" w:sz="6" w:val="single"/>
+              <w:left w:color="c4c7c5" w:space="0" w:sz="6" w:val="single"/>
+              <w:bottom w:color="c4c7c5" w:space="0" w:sz="6" w:val="single"/>
+              <w:right w:color="c4c7c5" w:space="0" w:sz="6" w:val="single"/>
+            </w:tcBorders>
+            <w:tcMar>
+              <w:top w:w="120.0" w:type="dxa"/>
+              <w:left w:w="180.0" w:type="dxa"/>
+              <w:bottom w:w="120.0" w:type="dxa"/>
+              <w:right w:w="180.0" w:type="dxa"/>
+            </w:tcMar>
+            <w:vAlign w:val="top"/>
+          </w:tcPr>
+          <w:p>
+            <w:pPr>
+              <w:spacing w:line="240" w:lineRule="auto"/>
+              <w:rPr/>
+            </w:pPr>
+            <w:r>
+              <w:rPr>
+                <w:rtl w:val="0"/>
+              </w:rPr>
+              <w:t xml:space="preserve">13-9-2026</w:t>
             </w:r>
           </w:p>
         </w:tc>
@@ -3476,53 +3477,54 @@
               <w:bottom w:color="c4c7c5" w:space="0" w:sz="6" w:val="single"/>
               <w:right w:color="c4c7c5" w:space="0" w:sz="6" w:val="single"/>
             </w:tcBorders>
-            <w:shd w:fill="ffd966" w:val="clear"/>
-            <w:tcMar>
-              <w:top w:w="120.0" w:type="dxa"/>
-              <w:left w:w="180.0" w:type="dxa"/>
-              <w:bottom w:w="120.0" w:type="dxa"/>
-              <w:right w:w="180.0" w:type="dxa"/>
-            </w:tcMar>
-            <w:vAlign w:val="top"/>
-          </w:tcPr>
-          <w:p>
-            <w:pPr>
-              <w:spacing w:line="240" w:lineRule="auto"/>
-              <w:rPr/>
-            </w:pPr>
-            <w:r>
-              <w:rPr>
-                <w:rtl w:val="0"/>
-              </w:rPr>
-              <w:t xml:space="preserve">Pendiente</w:t>
-            </w:r>
-          </w:p>
-        </w:tc>
-        <w:tc>
-          <w:tcPr>
-            <w:tcBorders>
-              <w:top w:color="c4c7c5" w:space="0" w:sz="6" w:val="single"/>
-              <w:left w:color="c4c7c5" w:space="0" w:sz="6" w:val="single"/>
-              <w:bottom w:color="c4c7c5" w:space="0" w:sz="6" w:val="single"/>
-              <w:right w:color="c4c7c5" w:space="0" w:sz="6" w:val="single"/>
-            </w:tcBorders>
-            <w:tcMar>
-              <w:top w:w="120.0" w:type="dxa"/>
-              <w:left w:w="180.0" w:type="dxa"/>
-              <w:bottom w:w="120.0" w:type="dxa"/>
-              <w:right w:w="180.0" w:type="dxa"/>
-            </w:tcMar>
-            <w:vAlign w:val="top"/>
-          </w:tcPr>
-          <w:p>
-            <w:pPr>
-              <w:spacing w:line="240" w:lineRule="auto"/>
-              <w:rPr/>
-            </w:pPr>
-            <w:r>
-              <w:rPr>
-                <w:rtl w:val="0"/>
-              </w:rPr>
+            <w:shd w:fill="93c47d" w:val="clear"/>
+            <w:tcMar>
+              <w:top w:w="120.0" w:type="dxa"/>
+              <w:left w:w="180.0" w:type="dxa"/>
+              <w:bottom w:w="120.0" w:type="dxa"/>
+              <w:right w:w="180.0" w:type="dxa"/>
+            </w:tcMar>
+            <w:vAlign w:val="top"/>
+          </w:tcPr>
+          <w:p>
+            <w:pPr>
+              <w:spacing w:line="240" w:lineRule="auto"/>
+              <w:rPr/>
+            </w:pPr>
+            <w:r>
+              <w:rPr>
+                <w:rtl w:val="0"/>
+              </w:rPr>
+              <w:t xml:space="preserve">Completada</w:t>
+            </w:r>
+          </w:p>
+        </w:tc>
+        <w:tc>
+          <w:tcPr>
+            <w:tcBorders>
+              <w:top w:color="c4c7c5" w:space="0" w:sz="6" w:val="single"/>
+              <w:left w:color="c4c7c5" w:space="0" w:sz="6" w:val="single"/>
+              <w:bottom w:color="c4c7c5" w:space="0" w:sz="6" w:val="single"/>
+              <w:right w:color="c4c7c5" w:space="0" w:sz="6" w:val="single"/>
+            </w:tcBorders>
+            <w:tcMar>
+              <w:top w:w="120.0" w:type="dxa"/>
+              <w:left w:w="180.0" w:type="dxa"/>
+              <w:bottom w:w="120.0" w:type="dxa"/>
+              <w:right w:w="180.0" w:type="dxa"/>
+            </w:tcMar>
+            <w:vAlign w:val="top"/>
+          </w:tcPr>
+          <w:p>
+            <w:pPr>
+              <w:spacing w:line="240" w:lineRule="auto"/>
+              <w:rPr/>
+            </w:pPr>
+            <w:r>
+              <w:rPr>
+                <w:rtl w:val="0"/>
+              </w:rPr>
+              <w:t xml:space="preserve">13-9-2026</w:t>
             </w:r>
           </w:p>
         </w:tc>

</xml_diff>

<commit_message>
Se completó el modelo lógico del MODULO 2 (Tareas asociadas a eventos)
</commit_message>
<xml_diff>
--- a/Docs/Matriz de trazabilidad.docx
+++ b/Docs/Matriz de trazabilidad.docx
@@ -32,7 +32,7 @@
     <w:tbl>
       <w:tblPr>
         <w:tblStyle w:val="Table1"/>
-        <w:tblW w:w="9105.0" w:type="dxa"/>
+        <w:tblW w:w="9105.000000000002" w:type="dxa"/>
         <w:jc w:val="left"/>
         <w:tblBorders>
           <w:top w:color="000000" w:space="0" w:sz="0" w:val="nil"/>
@@ -46,18 +46,18 @@
         <w:tblLook w:val="0600"/>
       </w:tblPr>
       <w:tblGrid>
-        <w:gridCol w:w="825"/>
-        <w:gridCol w:w="1650"/>
-        <w:gridCol w:w="3300"/>
-        <w:gridCol w:w="1665"/>
-        <w:gridCol w:w="1665"/>
+        <w:gridCol w:w="1821.0000000000002"/>
+        <w:gridCol w:w="1821.0000000000002"/>
+        <w:gridCol w:w="1821.0000000000002"/>
+        <w:gridCol w:w="1821.0000000000002"/>
+        <w:gridCol w:w="1821.0000000000002"/>
         <w:tblGridChange w:id="0">
           <w:tblGrid>
-            <w:gridCol w:w="825"/>
-            <w:gridCol w:w="1650"/>
-            <w:gridCol w:w="3300"/>
-            <w:gridCol w:w="1665"/>
-            <w:gridCol w:w="1665"/>
+            <w:gridCol w:w="1821.0000000000002"/>
+            <w:gridCol w:w="1821.0000000000002"/>
+            <w:gridCol w:w="1821.0000000000002"/>
+            <w:gridCol w:w="1821.0000000000002"/>
+            <w:gridCol w:w="1821.0000000000002"/>
           </w:tblGrid>
         </w:tblGridChange>
       </w:tblGrid>
@@ -1893,7 +1893,7 @@
     <w:tbl>
       <w:tblPr>
         <w:tblStyle w:val="Table2"/>
-        <w:tblW w:w="9030.0" w:type="dxa"/>
+        <w:tblW w:w="9030.000000000002" w:type="dxa"/>
         <w:jc w:val="left"/>
         <w:tblBorders>
           <w:top w:color="000000" w:space="0" w:sz="0" w:val="nil"/>
@@ -1907,18 +1907,18 @@
         <w:tblLook w:val="0600"/>
       </w:tblPr>
       <w:tblGrid>
-        <w:gridCol w:w="1125"/>
-        <w:gridCol w:w="2265"/>
-        <w:gridCol w:w="2445"/>
-        <w:gridCol w:w="1620"/>
-        <w:gridCol w:w="1575"/>
+        <w:gridCol w:w="1806.0000000000002"/>
+        <w:gridCol w:w="1806.0000000000002"/>
+        <w:gridCol w:w="1806.0000000000002"/>
+        <w:gridCol w:w="1806.0000000000002"/>
+        <w:gridCol w:w="1806.0000000000002"/>
         <w:tblGridChange w:id="0">
           <w:tblGrid>
-            <w:gridCol w:w="1125"/>
-            <w:gridCol w:w="2265"/>
-            <w:gridCol w:w="2445"/>
-            <w:gridCol w:w="1620"/>
-            <w:gridCol w:w="1575"/>
+            <w:gridCol w:w="1806.0000000000002"/>
+            <w:gridCol w:w="1806.0000000000002"/>
+            <w:gridCol w:w="1806.0000000000002"/>
+            <w:gridCol w:w="1806.0000000000002"/>
+            <w:gridCol w:w="1806.0000000000002"/>
           </w:tblGrid>
         </w:tblGridChange>
       </w:tblGrid>
@@ -3167,7 +3167,7 @@
     <w:tbl>
       <w:tblPr>
         <w:tblStyle w:val="Table3"/>
-        <w:tblW w:w="8205.0" w:type="dxa"/>
+        <w:tblW w:w="8205.000000000002" w:type="dxa"/>
         <w:jc w:val="left"/>
         <w:tblBorders>
           <w:top w:color="000000" w:space="0" w:sz="0" w:val="nil"/>
@@ -3181,18 +3181,18 @@
         <w:tblLook w:val="0600"/>
       </w:tblPr>
       <w:tblGrid>
-        <w:gridCol w:w="1350"/>
-        <w:gridCol w:w="1560"/>
-        <w:gridCol w:w="2265"/>
-        <w:gridCol w:w="1485"/>
-        <w:gridCol w:w="1545"/>
+        <w:gridCol w:w="1641.0000000000002"/>
+        <w:gridCol w:w="1641.0000000000002"/>
+        <w:gridCol w:w="1641.0000000000002"/>
+        <w:gridCol w:w="1641.0000000000002"/>
+        <w:gridCol w:w="1641.0000000000002"/>
         <w:tblGridChange w:id="0">
           <w:tblGrid>
-            <w:gridCol w:w="1350"/>
-            <w:gridCol w:w="1560"/>
-            <w:gridCol w:w="2265"/>
-            <w:gridCol w:w="1485"/>
-            <w:gridCol w:w="1545"/>
+            <w:gridCol w:w="1641.0000000000002"/>
+            <w:gridCol w:w="1641.0000000000002"/>
+            <w:gridCol w:w="1641.0000000000002"/>
+            <w:gridCol w:w="1641.0000000000002"/>
+            <w:gridCol w:w="1641.0000000000002"/>
           </w:tblGrid>
         </w:tblGridChange>
       </w:tblGrid>
@@ -3630,53 +3630,54 @@
               <w:bottom w:color="c4c7c5" w:space="0" w:sz="6" w:val="single"/>
               <w:right w:color="c4c7c5" w:space="0" w:sz="6" w:val="single"/>
             </w:tcBorders>
-            <w:shd w:fill="ffd966" w:val="clear"/>
-            <w:tcMar>
-              <w:top w:w="120.0" w:type="dxa"/>
-              <w:left w:w="180.0" w:type="dxa"/>
-              <w:bottom w:w="120.0" w:type="dxa"/>
-              <w:right w:w="180.0" w:type="dxa"/>
-            </w:tcMar>
-            <w:vAlign w:val="top"/>
-          </w:tcPr>
-          <w:p>
-            <w:pPr>
-              <w:spacing w:line="240" w:lineRule="auto"/>
-              <w:rPr/>
-            </w:pPr>
-            <w:r>
-              <w:rPr>
-                <w:rtl w:val="0"/>
-              </w:rPr>
-              <w:t xml:space="preserve">Pendiente</w:t>
-            </w:r>
-          </w:p>
-        </w:tc>
-        <w:tc>
-          <w:tcPr>
-            <w:tcBorders>
-              <w:top w:color="c4c7c5" w:space="0" w:sz="6" w:val="single"/>
-              <w:left w:color="c4c7c5" w:space="0" w:sz="6" w:val="single"/>
-              <w:bottom w:color="c4c7c5" w:space="0" w:sz="6" w:val="single"/>
-              <w:right w:color="c4c7c5" w:space="0" w:sz="6" w:val="single"/>
-            </w:tcBorders>
-            <w:tcMar>
-              <w:top w:w="120.0" w:type="dxa"/>
-              <w:left w:w="180.0" w:type="dxa"/>
-              <w:bottom w:w="120.0" w:type="dxa"/>
-              <w:right w:w="180.0" w:type="dxa"/>
-            </w:tcMar>
-            <w:vAlign w:val="top"/>
-          </w:tcPr>
-          <w:p>
-            <w:pPr>
-              <w:spacing w:line="240" w:lineRule="auto"/>
-              <w:rPr/>
-            </w:pPr>
-            <w:r>
-              <w:rPr>
-                <w:rtl w:val="0"/>
-              </w:rPr>
+            <w:shd w:fill="93c47d" w:val="clear"/>
+            <w:tcMar>
+              <w:top w:w="120.0" w:type="dxa"/>
+              <w:left w:w="180.0" w:type="dxa"/>
+              <w:bottom w:w="120.0" w:type="dxa"/>
+              <w:right w:w="180.0" w:type="dxa"/>
+            </w:tcMar>
+            <w:vAlign w:val="top"/>
+          </w:tcPr>
+          <w:p>
+            <w:pPr>
+              <w:spacing w:line="240" w:lineRule="auto"/>
+              <w:rPr/>
+            </w:pPr>
+            <w:r>
+              <w:rPr>
+                <w:rtl w:val="0"/>
+              </w:rPr>
+              <w:t xml:space="preserve">Completado</w:t>
+            </w:r>
+          </w:p>
+        </w:tc>
+        <w:tc>
+          <w:tcPr>
+            <w:tcBorders>
+              <w:top w:color="c4c7c5" w:space="0" w:sz="6" w:val="single"/>
+              <w:left w:color="c4c7c5" w:space="0" w:sz="6" w:val="single"/>
+              <w:bottom w:color="c4c7c5" w:space="0" w:sz="6" w:val="single"/>
+              <w:right w:color="c4c7c5" w:space="0" w:sz="6" w:val="single"/>
+            </w:tcBorders>
+            <w:tcMar>
+              <w:top w:w="120.0" w:type="dxa"/>
+              <w:left w:w="180.0" w:type="dxa"/>
+              <w:bottom w:w="120.0" w:type="dxa"/>
+              <w:right w:w="180.0" w:type="dxa"/>
+            </w:tcMar>
+            <w:vAlign w:val="top"/>
+          </w:tcPr>
+          <w:p>
+            <w:pPr>
+              <w:spacing w:line="240" w:lineRule="auto"/>
+              <w:rPr/>
+            </w:pPr>
+            <w:r>
+              <w:rPr>
+                <w:rtl w:val="0"/>
+              </w:rPr>
+              <w:t xml:space="preserve">13-9-2026</w:t>
             </w:r>
           </w:p>
         </w:tc>

</xml_diff>

<commit_message>
Creacion de la tabla Tareas, documentacion del modelo físico RF-15 terminado y se marcó completado en la matriz
</commit_message>
<xml_diff>
--- a/Docs/Matriz de trazabilidad.docx
+++ b/Docs/Matriz de trazabilidad.docx
@@ -3783,53 +3783,54 @@
               <w:bottom w:color="c4c7c5" w:space="0" w:sz="6" w:val="single"/>
               <w:right w:color="c4c7c5" w:space="0" w:sz="6" w:val="single"/>
             </w:tcBorders>
-            <w:shd w:fill="ffd966" w:val="clear"/>
-            <w:tcMar>
-              <w:top w:w="120.0" w:type="dxa"/>
-              <w:left w:w="180.0" w:type="dxa"/>
-              <w:bottom w:w="120.0" w:type="dxa"/>
-              <w:right w:w="180.0" w:type="dxa"/>
-            </w:tcMar>
-            <w:vAlign w:val="top"/>
-          </w:tcPr>
-          <w:p>
-            <w:pPr>
-              <w:spacing w:line="240" w:lineRule="auto"/>
-              <w:rPr/>
-            </w:pPr>
-            <w:r>
-              <w:rPr>
-                <w:rtl w:val="0"/>
-              </w:rPr>
-              <w:t xml:space="preserve">Pendiente</w:t>
-            </w:r>
-          </w:p>
-        </w:tc>
-        <w:tc>
-          <w:tcPr>
-            <w:tcBorders>
-              <w:top w:color="c4c7c5" w:space="0" w:sz="6" w:val="single"/>
-              <w:left w:color="c4c7c5" w:space="0" w:sz="6" w:val="single"/>
-              <w:bottom w:color="c4c7c5" w:space="0" w:sz="6" w:val="single"/>
-              <w:right w:color="c4c7c5" w:space="0" w:sz="6" w:val="single"/>
-            </w:tcBorders>
-            <w:tcMar>
-              <w:top w:w="120.0" w:type="dxa"/>
-              <w:left w:w="180.0" w:type="dxa"/>
-              <w:bottom w:w="120.0" w:type="dxa"/>
-              <w:right w:w="180.0" w:type="dxa"/>
-            </w:tcMar>
-            <w:vAlign w:val="top"/>
-          </w:tcPr>
-          <w:p>
-            <w:pPr>
-              <w:spacing w:line="240" w:lineRule="auto"/>
-              <w:rPr/>
-            </w:pPr>
-            <w:r>
-              <w:rPr>
-                <w:rtl w:val="0"/>
-              </w:rPr>
+            <w:shd w:fill="93c47d" w:val="clear"/>
+            <w:tcMar>
+              <w:top w:w="120.0" w:type="dxa"/>
+              <w:left w:w="180.0" w:type="dxa"/>
+              <w:bottom w:w="120.0" w:type="dxa"/>
+              <w:right w:w="180.0" w:type="dxa"/>
+            </w:tcMar>
+            <w:vAlign w:val="top"/>
+          </w:tcPr>
+          <w:p>
+            <w:pPr>
+              <w:spacing w:line="240" w:lineRule="auto"/>
+              <w:rPr/>
+            </w:pPr>
+            <w:r>
+              <w:rPr>
+                <w:rtl w:val="0"/>
+              </w:rPr>
+              <w:t xml:space="preserve">Completado</w:t>
+            </w:r>
+          </w:p>
+        </w:tc>
+        <w:tc>
+          <w:tcPr>
+            <w:tcBorders>
+              <w:top w:color="c4c7c5" w:space="0" w:sz="6" w:val="single"/>
+              <w:left w:color="c4c7c5" w:space="0" w:sz="6" w:val="single"/>
+              <w:bottom w:color="c4c7c5" w:space="0" w:sz="6" w:val="single"/>
+              <w:right w:color="c4c7c5" w:space="0" w:sz="6" w:val="single"/>
+            </w:tcBorders>
+            <w:tcMar>
+              <w:top w:w="120.0" w:type="dxa"/>
+              <w:left w:w="180.0" w:type="dxa"/>
+              <w:bottom w:w="120.0" w:type="dxa"/>
+              <w:right w:w="180.0" w:type="dxa"/>
+            </w:tcMar>
+            <w:vAlign w:val="top"/>
+          </w:tcPr>
+          <w:p>
+            <w:pPr>
+              <w:spacing w:line="240" w:lineRule="auto"/>
+              <w:rPr/>
+            </w:pPr>
+            <w:r>
+              <w:rPr>
+                <w:rtl w:val="0"/>
+              </w:rPr>
+              <w:t xml:space="preserve">13-9-2026</w:t>
             </w:r>
           </w:p>
         </w:tc>

</xml_diff>

<commit_message>
Documentacion del modelo físico y se marcó completado en la matriz, falta solo interfaz grafica del MODULO 2, igual que el MODULO 1
</commit_message>
<xml_diff>
--- a/Docs/Matriz de trazabilidad.docx
+++ b/Docs/Matriz de trazabilidad.docx
@@ -3167,7 +3167,7 @@
     <w:tbl>
       <w:tblPr>
         <w:tblStyle w:val="Table3"/>
-        <w:tblW w:w="8205.000000000002" w:type="dxa"/>
+        <w:tblW w:w="8190.0" w:type="dxa"/>
         <w:jc w:val="left"/>
         <w:tblBorders>
           <w:top w:color="000000" w:space="0" w:sz="0" w:val="nil"/>
@@ -3181,18 +3181,18 @@
         <w:tblLook w:val="0600"/>
       </w:tblPr>
       <w:tblGrid>
-        <w:gridCol w:w="1641.0000000000002"/>
-        <w:gridCol w:w="1641.0000000000002"/>
-        <w:gridCol w:w="1641.0000000000002"/>
-        <w:gridCol w:w="1641.0000000000002"/>
-        <w:gridCol w:w="1641.0000000000002"/>
+        <w:gridCol w:w="1635"/>
+        <w:gridCol w:w="1635"/>
+        <w:gridCol w:w="1635"/>
+        <w:gridCol w:w="1635"/>
+        <w:gridCol w:w="1650"/>
         <w:tblGridChange w:id="0">
           <w:tblGrid>
-            <w:gridCol w:w="1641.0000000000002"/>
-            <w:gridCol w:w="1641.0000000000002"/>
-            <w:gridCol w:w="1641.0000000000002"/>
-            <w:gridCol w:w="1641.0000000000002"/>
-            <w:gridCol w:w="1641.0000000000002"/>
+            <w:gridCol w:w="1635"/>
+            <w:gridCol w:w="1635"/>
+            <w:gridCol w:w="1635"/>
+            <w:gridCol w:w="1635"/>
+            <w:gridCol w:w="1650"/>
           </w:tblGrid>
         </w:tblGridChange>
       </w:tblGrid>
@@ -4111,53 +4111,54 @@
               <w:bottom w:color="c4c7c5" w:space="0" w:sz="6" w:val="single"/>
               <w:right w:color="c4c7c5" w:space="0" w:sz="6" w:val="single"/>
             </w:tcBorders>
-            <w:shd w:fill="ffd966" w:val="clear"/>
-            <w:tcMar>
-              <w:top w:w="120.0" w:type="dxa"/>
-              <w:left w:w="180.0" w:type="dxa"/>
-              <w:bottom w:w="120.0" w:type="dxa"/>
-              <w:right w:w="180.0" w:type="dxa"/>
-            </w:tcMar>
-            <w:vAlign w:val="top"/>
-          </w:tcPr>
-          <w:p>
-            <w:pPr>
-              <w:spacing w:line="240" w:lineRule="auto"/>
-              <w:rPr/>
-            </w:pPr>
-            <w:r>
-              <w:rPr>
-                <w:rtl w:val="0"/>
-              </w:rPr>
-              <w:t xml:space="preserve">Pendiente</w:t>
-            </w:r>
-          </w:p>
-        </w:tc>
-        <w:tc>
-          <w:tcPr>
-            <w:tcBorders>
-              <w:top w:color="c4c7c5" w:space="0" w:sz="6" w:val="single"/>
-              <w:left w:color="c4c7c5" w:space="0" w:sz="6" w:val="single"/>
-              <w:bottom w:color="c4c7c5" w:space="0" w:sz="6" w:val="single"/>
-              <w:right w:color="c4c7c5" w:space="0" w:sz="6" w:val="single"/>
-            </w:tcBorders>
-            <w:tcMar>
-              <w:top w:w="120.0" w:type="dxa"/>
-              <w:left w:w="180.0" w:type="dxa"/>
-              <w:bottom w:w="120.0" w:type="dxa"/>
-              <w:right w:w="180.0" w:type="dxa"/>
-            </w:tcMar>
-            <w:vAlign w:val="top"/>
-          </w:tcPr>
-          <w:p>
-            <w:pPr>
-              <w:spacing w:line="240" w:lineRule="auto"/>
-              <w:rPr/>
-            </w:pPr>
-            <w:r>
-              <w:rPr>
-                <w:rtl w:val="0"/>
-              </w:rPr>
+            <w:shd w:fill="93c47d" w:val="clear"/>
+            <w:tcMar>
+              <w:top w:w="120.0" w:type="dxa"/>
+              <w:left w:w="180.0" w:type="dxa"/>
+              <w:bottom w:w="120.0" w:type="dxa"/>
+              <w:right w:w="180.0" w:type="dxa"/>
+            </w:tcMar>
+            <w:vAlign w:val="top"/>
+          </w:tcPr>
+          <w:p>
+            <w:pPr>
+              <w:spacing w:line="240" w:lineRule="auto"/>
+              <w:rPr/>
+            </w:pPr>
+            <w:r>
+              <w:rPr>
+                <w:rtl w:val="0"/>
+              </w:rPr>
+              <w:t xml:space="preserve">Completado</w:t>
+            </w:r>
+          </w:p>
+        </w:tc>
+        <w:tc>
+          <w:tcPr>
+            <w:tcBorders>
+              <w:top w:color="c4c7c5" w:space="0" w:sz="6" w:val="single"/>
+              <w:left w:color="c4c7c5" w:space="0" w:sz="6" w:val="single"/>
+              <w:bottom w:color="c4c7c5" w:space="0" w:sz="6" w:val="single"/>
+              <w:right w:color="c4c7c5" w:space="0" w:sz="6" w:val="single"/>
+            </w:tcBorders>
+            <w:tcMar>
+              <w:top w:w="120.0" w:type="dxa"/>
+              <w:left w:w="180.0" w:type="dxa"/>
+              <w:bottom w:w="120.0" w:type="dxa"/>
+              <w:right w:w="180.0" w:type="dxa"/>
+            </w:tcMar>
+            <w:vAlign w:val="top"/>
+          </w:tcPr>
+          <w:p>
+            <w:pPr>
+              <w:spacing w:line="240" w:lineRule="auto"/>
+              <w:rPr/>
+            </w:pPr>
+            <w:r>
+              <w:rPr>
+                <w:rtl w:val="0"/>
+              </w:rPr>
+              <w:t xml:space="preserve">14-9-2026</w:t>
             </w:r>
           </w:p>
         </w:tc>
@@ -4438,53 +4439,54 @@
               <w:bottom w:color="c4c7c5" w:space="0" w:sz="6" w:val="single"/>
               <w:right w:color="c4c7c5" w:space="0" w:sz="6" w:val="single"/>
             </w:tcBorders>
-            <w:shd w:fill="ffd966" w:val="clear"/>
-            <w:tcMar>
-              <w:top w:w="120.0" w:type="dxa"/>
-              <w:left w:w="180.0" w:type="dxa"/>
-              <w:bottom w:w="120.0" w:type="dxa"/>
-              <w:right w:w="180.0" w:type="dxa"/>
-            </w:tcMar>
-            <w:vAlign w:val="top"/>
-          </w:tcPr>
-          <w:p>
-            <w:pPr>
-              <w:spacing w:line="240" w:lineRule="auto"/>
-              <w:rPr/>
-            </w:pPr>
-            <w:r>
-              <w:rPr>
-                <w:rtl w:val="0"/>
-              </w:rPr>
-              <w:t xml:space="preserve">Pendiente</w:t>
-            </w:r>
-          </w:p>
-        </w:tc>
-        <w:tc>
-          <w:tcPr>
-            <w:tcBorders>
-              <w:top w:color="c4c7c5" w:space="0" w:sz="6" w:val="single"/>
-              <w:left w:color="c4c7c5" w:space="0" w:sz="6" w:val="single"/>
-              <w:bottom w:color="c4c7c5" w:space="0" w:sz="6" w:val="single"/>
-              <w:right w:color="c4c7c5" w:space="0" w:sz="6" w:val="single"/>
-            </w:tcBorders>
-            <w:tcMar>
-              <w:top w:w="120.0" w:type="dxa"/>
-              <w:left w:w="180.0" w:type="dxa"/>
-              <w:bottom w:w="120.0" w:type="dxa"/>
-              <w:right w:w="180.0" w:type="dxa"/>
-            </w:tcMar>
-            <w:vAlign w:val="top"/>
-          </w:tcPr>
-          <w:p>
-            <w:pPr>
-              <w:spacing w:line="240" w:lineRule="auto"/>
-              <w:rPr/>
-            </w:pPr>
-            <w:r>
-              <w:rPr>
-                <w:rtl w:val="0"/>
-              </w:rPr>
+            <w:shd w:fill="93c47d" w:val="clear"/>
+            <w:tcMar>
+              <w:top w:w="120.0" w:type="dxa"/>
+              <w:left w:w="180.0" w:type="dxa"/>
+              <w:bottom w:w="120.0" w:type="dxa"/>
+              <w:right w:w="180.0" w:type="dxa"/>
+            </w:tcMar>
+            <w:vAlign w:val="top"/>
+          </w:tcPr>
+          <w:p>
+            <w:pPr>
+              <w:spacing w:line="240" w:lineRule="auto"/>
+              <w:rPr/>
+            </w:pPr>
+            <w:r>
+              <w:rPr>
+                <w:rtl w:val="0"/>
+              </w:rPr>
+              <w:t xml:space="preserve">Completada</w:t>
+            </w:r>
+          </w:p>
+        </w:tc>
+        <w:tc>
+          <w:tcPr>
+            <w:tcBorders>
+              <w:top w:color="c4c7c5" w:space="0" w:sz="6" w:val="single"/>
+              <w:left w:color="c4c7c5" w:space="0" w:sz="6" w:val="single"/>
+              <w:bottom w:color="c4c7c5" w:space="0" w:sz="6" w:val="single"/>
+              <w:right w:color="c4c7c5" w:space="0" w:sz="6" w:val="single"/>
+            </w:tcBorders>
+            <w:tcMar>
+              <w:top w:w="120.0" w:type="dxa"/>
+              <w:left w:w="180.0" w:type="dxa"/>
+              <w:bottom w:w="120.0" w:type="dxa"/>
+              <w:right w:w="180.0" w:type="dxa"/>
+            </w:tcMar>
+            <w:vAlign w:val="top"/>
+          </w:tcPr>
+          <w:p>
+            <w:pPr>
+              <w:spacing w:line="240" w:lineRule="auto"/>
+              <w:rPr/>
+            </w:pPr>
+            <w:r>
+              <w:rPr>
+                <w:rtl w:val="0"/>
+              </w:rPr>
+              <w:t xml:space="preserve">14-9-2026</w:t>
             </w:r>
           </w:p>
         </w:tc>

</xml_diff>

<commit_message>
Modelo conceptual y su completado en la matriz de MODULO 3 (Disponibilidad)
</commit_message>
<xml_diff>
--- a/Docs/Matriz de trazabilidad.docx
+++ b/Docs/Matriz de trazabilidad.docx
@@ -1893,7 +1893,7 @@
     <w:tbl>
       <w:tblPr>
         <w:tblStyle w:val="Table2"/>
-        <w:tblW w:w="9030.000000000002" w:type="dxa"/>
+        <w:tblW w:w="9000.0" w:type="dxa"/>
         <w:jc w:val="left"/>
         <w:tblBorders>
           <w:top w:color="000000" w:space="0" w:sz="0" w:val="nil"/>
@@ -1907,18 +1907,18 @@
         <w:tblLook w:val="0600"/>
       </w:tblPr>
       <w:tblGrid>
-        <w:gridCol w:w="1806.0000000000002"/>
-        <w:gridCol w:w="1806.0000000000002"/>
-        <w:gridCol w:w="1806.0000000000002"/>
-        <w:gridCol w:w="1806.0000000000002"/>
-        <w:gridCol w:w="1806.0000000000002"/>
+        <w:gridCol w:w="1800"/>
+        <w:gridCol w:w="1800"/>
+        <w:gridCol w:w="1800"/>
+        <w:gridCol w:w="1725"/>
+        <w:gridCol w:w="1875"/>
         <w:tblGridChange w:id="0">
           <w:tblGrid>
-            <w:gridCol w:w="1806.0000000000002"/>
-            <w:gridCol w:w="1806.0000000000002"/>
-            <w:gridCol w:w="1806.0000000000002"/>
-            <w:gridCol w:w="1806.0000000000002"/>
-            <w:gridCol w:w="1806.0000000000002"/>
+            <w:gridCol w:w="1800"/>
+            <w:gridCol w:w="1800"/>
+            <w:gridCol w:w="1800"/>
+            <w:gridCol w:w="1725"/>
+            <w:gridCol w:w="1875"/>
           </w:tblGrid>
         </w:tblGridChange>
       </w:tblGrid>
@@ -2203,53 +2203,54 @@
               <w:bottom w:color="c4c7c5" w:space="0" w:sz="6" w:val="single"/>
               <w:right w:color="c4c7c5" w:space="0" w:sz="6" w:val="single"/>
             </w:tcBorders>
-            <w:shd w:fill="ffd966" w:val="clear"/>
-            <w:tcMar>
-              <w:top w:w="120.0" w:type="dxa"/>
-              <w:left w:w="180.0" w:type="dxa"/>
-              <w:bottom w:w="120.0" w:type="dxa"/>
-              <w:right w:w="180.0" w:type="dxa"/>
-            </w:tcMar>
-            <w:vAlign w:val="top"/>
-          </w:tcPr>
-          <w:p>
-            <w:pPr>
-              <w:spacing w:line="240" w:lineRule="auto"/>
-              <w:rPr/>
-            </w:pPr>
-            <w:r>
-              <w:rPr>
-                <w:rtl w:val="0"/>
-              </w:rPr>
-              <w:t xml:space="preserve">Pendiente</w:t>
-            </w:r>
-          </w:p>
-        </w:tc>
-        <w:tc>
-          <w:tcPr>
-            <w:tcBorders>
-              <w:top w:color="c4c7c5" w:space="0" w:sz="6" w:val="single"/>
-              <w:left w:color="c4c7c5" w:space="0" w:sz="6" w:val="single"/>
-              <w:bottom w:color="c4c7c5" w:space="0" w:sz="6" w:val="single"/>
-              <w:right w:color="c4c7c5" w:space="0" w:sz="6" w:val="single"/>
-            </w:tcBorders>
-            <w:tcMar>
-              <w:top w:w="120.0" w:type="dxa"/>
-              <w:left w:w="180.0" w:type="dxa"/>
-              <w:bottom w:w="120.0" w:type="dxa"/>
-              <w:right w:w="180.0" w:type="dxa"/>
-            </w:tcMar>
-            <w:vAlign w:val="top"/>
-          </w:tcPr>
-          <w:p>
-            <w:pPr>
-              <w:spacing w:line="240" w:lineRule="auto"/>
-              <w:rPr/>
-            </w:pPr>
-            <w:r>
-              <w:rPr>
-                <w:rtl w:val="0"/>
-              </w:rPr>
+            <w:shd w:fill="93c47d" w:val="clear"/>
+            <w:tcMar>
+              <w:top w:w="120.0" w:type="dxa"/>
+              <w:left w:w="180.0" w:type="dxa"/>
+              <w:bottom w:w="120.0" w:type="dxa"/>
+              <w:right w:w="180.0" w:type="dxa"/>
+            </w:tcMar>
+            <w:vAlign w:val="top"/>
+          </w:tcPr>
+          <w:p>
+            <w:pPr>
+              <w:spacing w:line="240" w:lineRule="auto"/>
+              <w:rPr/>
+            </w:pPr>
+            <w:r>
+              <w:rPr>
+                <w:rtl w:val="0"/>
+              </w:rPr>
+              <w:t xml:space="preserve">Completado</w:t>
+            </w:r>
+          </w:p>
+        </w:tc>
+        <w:tc>
+          <w:tcPr>
+            <w:tcBorders>
+              <w:top w:color="c4c7c5" w:space="0" w:sz="6" w:val="single"/>
+              <w:left w:color="c4c7c5" w:space="0" w:sz="6" w:val="single"/>
+              <w:bottom w:color="c4c7c5" w:space="0" w:sz="6" w:val="single"/>
+              <w:right w:color="c4c7c5" w:space="0" w:sz="6" w:val="single"/>
+            </w:tcBorders>
+            <w:tcMar>
+              <w:top w:w="120.0" w:type="dxa"/>
+              <w:left w:w="180.0" w:type="dxa"/>
+              <w:bottom w:w="120.0" w:type="dxa"/>
+              <w:right w:w="180.0" w:type="dxa"/>
+            </w:tcMar>
+            <w:vAlign w:val="top"/>
+          </w:tcPr>
+          <w:p>
+            <w:pPr>
+              <w:spacing w:line="240" w:lineRule="auto"/>
+              <w:rPr/>
+            </w:pPr>
+            <w:r>
+              <w:rPr>
+                <w:rtl w:val="0"/>
+              </w:rPr>
+              <w:t xml:space="preserve">14-9-2026</w:t>
             </w:r>
           </w:p>
         </w:tc>

</xml_diff>

<commit_message>
Se termino el modelo logico del MODULO 3 (Disponibilidad)
</commit_message>
<xml_diff>
--- a/Docs/Matriz de trazabilidad.docx
+++ b/Docs/Matriz de trazabilidad.docx
@@ -2358,53 +2358,54 @@
               <w:bottom w:color="c4c7c5" w:space="0" w:sz="6" w:val="single"/>
               <w:right w:color="c4c7c5" w:space="0" w:sz="6" w:val="single"/>
             </w:tcBorders>
-            <w:shd w:fill="ffd966" w:val="clear"/>
-            <w:tcMar>
-              <w:top w:w="120.0" w:type="dxa"/>
-              <w:left w:w="180.0" w:type="dxa"/>
-              <w:bottom w:w="120.0" w:type="dxa"/>
-              <w:right w:w="180.0" w:type="dxa"/>
-            </w:tcMar>
-            <w:vAlign w:val="top"/>
-          </w:tcPr>
-          <w:p>
-            <w:pPr>
-              <w:spacing w:line="240" w:lineRule="auto"/>
-              <w:rPr/>
-            </w:pPr>
-            <w:r>
-              <w:rPr>
-                <w:rtl w:val="0"/>
-              </w:rPr>
-              <w:t xml:space="preserve">Pendiente</w:t>
-            </w:r>
-          </w:p>
-        </w:tc>
-        <w:tc>
-          <w:tcPr>
-            <w:tcBorders>
-              <w:top w:color="c4c7c5" w:space="0" w:sz="6" w:val="single"/>
-              <w:left w:color="c4c7c5" w:space="0" w:sz="6" w:val="single"/>
-              <w:bottom w:color="c4c7c5" w:space="0" w:sz="6" w:val="single"/>
-              <w:right w:color="c4c7c5" w:space="0" w:sz="6" w:val="single"/>
-            </w:tcBorders>
-            <w:tcMar>
-              <w:top w:w="120.0" w:type="dxa"/>
-              <w:left w:w="180.0" w:type="dxa"/>
-              <w:bottom w:w="120.0" w:type="dxa"/>
-              <w:right w:w="180.0" w:type="dxa"/>
-            </w:tcMar>
-            <w:vAlign w:val="top"/>
-          </w:tcPr>
-          <w:p>
-            <w:pPr>
-              <w:spacing w:line="240" w:lineRule="auto"/>
-              <w:rPr/>
-            </w:pPr>
-            <w:r>
-              <w:rPr>
-                <w:rtl w:val="0"/>
-              </w:rPr>
+            <w:shd w:fill="93c47d" w:val="clear"/>
+            <w:tcMar>
+              <w:top w:w="120.0" w:type="dxa"/>
+              <w:left w:w="180.0" w:type="dxa"/>
+              <w:bottom w:w="120.0" w:type="dxa"/>
+              <w:right w:w="180.0" w:type="dxa"/>
+            </w:tcMar>
+            <w:vAlign w:val="top"/>
+          </w:tcPr>
+          <w:p>
+            <w:pPr>
+              <w:spacing w:line="240" w:lineRule="auto"/>
+              <w:rPr/>
+            </w:pPr>
+            <w:r>
+              <w:rPr>
+                <w:rtl w:val="0"/>
+              </w:rPr>
+              <w:t xml:space="preserve">Completado</w:t>
+            </w:r>
+          </w:p>
+        </w:tc>
+        <w:tc>
+          <w:tcPr>
+            <w:tcBorders>
+              <w:top w:color="c4c7c5" w:space="0" w:sz="6" w:val="single"/>
+              <w:left w:color="c4c7c5" w:space="0" w:sz="6" w:val="single"/>
+              <w:bottom w:color="c4c7c5" w:space="0" w:sz="6" w:val="single"/>
+              <w:right w:color="c4c7c5" w:space="0" w:sz="6" w:val="single"/>
+            </w:tcBorders>
+            <w:tcMar>
+              <w:top w:w="120.0" w:type="dxa"/>
+              <w:left w:w="180.0" w:type="dxa"/>
+              <w:bottom w:w="120.0" w:type="dxa"/>
+              <w:right w:w="180.0" w:type="dxa"/>
+            </w:tcMar>
+            <w:vAlign w:val="top"/>
+          </w:tcPr>
+          <w:p>
+            <w:pPr>
+              <w:spacing w:line="240" w:lineRule="auto"/>
+              <w:rPr/>
+            </w:pPr>
+            <w:r>
+              <w:rPr>
+                <w:rtl w:val="0"/>
+              </w:rPr>
+              <w:t xml:space="preserve">14-9-2026</w:t>
             </w:r>
           </w:p>
         </w:tc>

</xml_diff>

<commit_message>
Se terminó documentacion del modelo fisico del RF-11, se marcó en la matriz
</commit_message>
<xml_diff>
--- a/Docs/Matriz de trazabilidad.docx
+++ b/Docs/Matriz de trazabilidad.docx
@@ -2513,53 +2513,54 @@
               <w:bottom w:color="c4c7c5" w:space="0" w:sz="6" w:val="single"/>
               <w:right w:color="c4c7c5" w:space="0" w:sz="6" w:val="single"/>
             </w:tcBorders>
-            <w:shd w:fill="ffd966" w:val="clear"/>
-            <w:tcMar>
-              <w:top w:w="120.0" w:type="dxa"/>
-              <w:left w:w="180.0" w:type="dxa"/>
-              <w:bottom w:w="120.0" w:type="dxa"/>
-              <w:right w:w="180.0" w:type="dxa"/>
-            </w:tcMar>
-            <w:vAlign w:val="top"/>
-          </w:tcPr>
-          <w:p>
-            <w:pPr>
-              <w:spacing w:line="240" w:lineRule="auto"/>
-              <w:rPr/>
-            </w:pPr>
-            <w:r>
-              <w:rPr>
-                <w:rtl w:val="0"/>
-              </w:rPr>
-              <w:t xml:space="preserve">Pendiente</w:t>
-            </w:r>
-          </w:p>
-        </w:tc>
-        <w:tc>
-          <w:tcPr>
-            <w:tcBorders>
-              <w:top w:color="c4c7c5" w:space="0" w:sz="6" w:val="single"/>
-              <w:left w:color="c4c7c5" w:space="0" w:sz="6" w:val="single"/>
-              <w:bottom w:color="c4c7c5" w:space="0" w:sz="6" w:val="single"/>
-              <w:right w:color="c4c7c5" w:space="0" w:sz="6" w:val="single"/>
-            </w:tcBorders>
-            <w:tcMar>
-              <w:top w:w="120.0" w:type="dxa"/>
-              <w:left w:w="180.0" w:type="dxa"/>
-              <w:bottom w:w="120.0" w:type="dxa"/>
-              <w:right w:w="180.0" w:type="dxa"/>
-            </w:tcMar>
-            <w:vAlign w:val="top"/>
-          </w:tcPr>
-          <w:p>
-            <w:pPr>
-              <w:spacing w:line="240" w:lineRule="auto"/>
-              <w:rPr/>
-            </w:pPr>
-            <w:r>
-              <w:rPr>
-                <w:rtl w:val="0"/>
-              </w:rPr>
+            <w:shd w:fill="93c47d" w:val="clear"/>
+            <w:tcMar>
+              <w:top w:w="120.0" w:type="dxa"/>
+              <w:left w:w="180.0" w:type="dxa"/>
+              <w:bottom w:w="120.0" w:type="dxa"/>
+              <w:right w:w="180.0" w:type="dxa"/>
+            </w:tcMar>
+            <w:vAlign w:val="top"/>
+          </w:tcPr>
+          <w:p>
+            <w:pPr>
+              <w:spacing w:line="240" w:lineRule="auto"/>
+              <w:rPr/>
+            </w:pPr>
+            <w:r>
+              <w:rPr>
+                <w:rtl w:val="0"/>
+              </w:rPr>
+              <w:t xml:space="preserve">Completado</w:t>
+            </w:r>
+          </w:p>
+        </w:tc>
+        <w:tc>
+          <w:tcPr>
+            <w:tcBorders>
+              <w:top w:color="c4c7c5" w:space="0" w:sz="6" w:val="single"/>
+              <w:left w:color="c4c7c5" w:space="0" w:sz="6" w:val="single"/>
+              <w:bottom w:color="c4c7c5" w:space="0" w:sz="6" w:val="single"/>
+              <w:right w:color="c4c7c5" w:space="0" w:sz="6" w:val="single"/>
+            </w:tcBorders>
+            <w:tcMar>
+              <w:top w:w="120.0" w:type="dxa"/>
+              <w:left w:w="180.0" w:type="dxa"/>
+              <w:bottom w:w="120.0" w:type="dxa"/>
+              <w:right w:w="180.0" w:type="dxa"/>
+            </w:tcMar>
+            <w:vAlign w:val="top"/>
+          </w:tcPr>
+          <w:p>
+            <w:pPr>
+              <w:spacing w:line="240" w:lineRule="auto"/>
+              <w:rPr/>
+            </w:pPr>
+            <w:r>
+              <w:rPr>
+                <w:rtl w:val="0"/>
+              </w:rPr>
+              <w:t xml:space="preserve">14-9-2026</w:t>
             </w:r>
           </w:p>
         </w:tc>

</xml_diff>

<commit_message>
Modelo físico RF-12 MODULO 3 (Disponibilidad) documentado y marcado completado en matriz
</commit_message>
<xml_diff>
--- a/Docs/Matriz de trazabilidad.docx
+++ b/Docs/Matriz de trazabilidad.docx
@@ -2802,7 +2802,19 @@
               <w:rPr>
                 <w:rtl w:val="0"/>
               </w:rPr>
-              <w:t xml:space="preserve">3. Modelo Físico</w:t>
+              <w:t xml:space="preserve">3. Modelo Físico </w:t>
+            </w:r>
+          </w:p>
+          <w:p>
+            <w:pPr>
+              <w:spacing w:line="240" w:lineRule="auto"/>
+              <w:rPr/>
+            </w:pPr>
+            <w:r>
+              <w:rPr>
+                <w:rtl w:val="0"/>
+              </w:rPr>
+              <w:t xml:space="preserve">*Interfaz GUI</w:t>
             </w:r>
           </w:p>
         </w:tc>
@@ -2843,53 +2855,54 @@
               <w:bottom w:color="c4c7c5" w:space="0" w:sz="6" w:val="single"/>
               <w:right w:color="c4c7c5" w:space="0" w:sz="6" w:val="single"/>
             </w:tcBorders>
-            <w:shd w:fill="ffd966" w:val="clear"/>
-            <w:tcMar>
-              <w:top w:w="120.0" w:type="dxa"/>
-              <w:left w:w="180.0" w:type="dxa"/>
-              <w:bottom w:w="120.0" w:type="dxa"/>
-              <w:right w:w="180.0" w:type="dxa"/>
-            </w:tcMar>
-            <w:vAlign w:val="top"/>
-          </w:tcPr>
-          <w:p>
-            <w:pPr>
-              <w:spacing w:line="240" w:lineRule="auto"/>
-              <w:rPr/>
-            </w:pPr>
-            <w:r>
-              <w:rPr>
-                <w:rtl w:val="0"/>
-              </w:rPr>
-              <w:t xml:space="preserve">Pendiente</w:t>
-            </w:r>
-          </w:p>
-        </w:tc>
-        <w:tc>
-          <w:tcPr>
-            <w:tcBorders>
-              <w:top w:color="c4c7c5" w:space="0" w:sz="6" w:val="single"/>
-              <w:left w:color="c4c7c5" w:space="0" w:sz="6" w:val="single"/>
-              <w:bottom w:color="c4c7c5" w:space="0" w:sz="6" w:val="single"/>
-              <w:right w:color="c4c7c5" w:space="0" w:sz="6" w:val="single"/>
-            </w:tcBorders>
-            <w:tcMar>
-              <w:top w:w="120.0" w:type="dxa"/>
-              <w:left w:w="180.0" w:type="dxa"/>
-              <w:bottom w:w="120.0" w:type="dxa"/>
-              <w:right w:w="180.0" w:type="dxa"/>
-            </w:tcMar>
-            <w:vAlign w:val="top"/>
-          </w:tcPr>
-          <w:p>
-            <w:pPr>
-              <w:spacing w:line="240" w:lineRule="auto"/>
-              <w:rPr/>
-            </w:pPr>
-            <w:r>
-              <w:rPr>
-                <w:rtl w:val="0"/>
-              </w:rPr>
+            <w:shd w:fill="93c47d" w:val="clear"/>
+            <w:tcMar>
+              <w:top w:w="120.0" w:type="dxa"/>
+              <w:left w:w="180.0" w:type="dxa"/>
+              <w:bottom w:w="120.0" w:type="dxa"/>
+              <w:right w:w="180.0" w:type="dxa"/>
+            </w:tcMar>
+            <w:vAlign w:val="top"/>
+          </w:tcPr>
+          <w:p>
+            <w:pPr>
+              <w:spacing w:line="240" w:lineRule="auto"/>
+              <w:rPr/>
+            </w:pPr>
+            <w:r>
+              <w:rPr>
+                <w:rtl w:val="0"/>
+              </w:rPr>
+              <w:t xml:space="preserve">Completado</w:t>
+            </w:r>
+          </w:p>
+        </w:tc>
+        <w:tc>
+          <w:tcPr>
+            <w:tcBorders>
+              <w:top w:color="c4c7c5" w:space="0" w:sz="6" w:val="single"/>
+              <w:left w:color="c4c7c5" w:space="0" w:sz="6" w:val="single"/>
+              <w:bottom w:color="c4c7c5" w:space="0" w:sz="6" w:val="single"/>
+              <w:right w:color="c4c7c5" w:space="0" w:sz="6" w:val="single"/>
+            </w:tcBorders>
+            <w:tcMar>
+              <w:top w:w="120.0" w:type="dxa"/>
+              <w:left w:w="180.0" w:type="dxa"/>
+              <w:bottom w:w="120.0" w:type="dxa"/>
+              <w:right w:w="180.0" w:type="dxa"/>
+            </w:tcMar>
+            <w:vAlign w:val="top"/>
+          </w:tcPr>
+          <w:p>
+            <w:pPr>
+              <w:spacing w:line="240" w:lineRule="auto"/>
+              <w:rPr/>
+            </w:pPr>
+            <w:r>
+              <w:rPr>
+                <w:rtl w:val="0"/>
+              </w:rPr>
+              <w:t xml:space="preserve">14-9-2026</w:t>
             </w:r>
           </w:p>
         </w:tc>

</xml_diff>

<commit_message>
FINALIZACION COMPLETA DEL MODULO 1 (Gestion de ubicaciones)
</commit_message>
<xml_diff>
--- a/Docs/Matriz de trazabilidad.docx
+++ b/Docs/Matriz de trazabilidad.docx
@@ -781,6 +781,8 @@
                 <w:rtl w:val="0"/>
               </w:rPr>
               <w:t xml:space="preserve">4. Interfaz Gráfica (GUI)</w:t>
+              <w:br w:type="textWrapping"/>
+              <w:t xml:space="preserve">(Pestaña ubicaciones)</w:t>
             </w:r>
           </w:p>
         </w:tc>
@@ -821,53 +823,54 @@
               <w:bottom w:color="c4c7c5" w:space="0" w:sz="6" w:val="single"/>
               <w:right w:color="c4c7c5" w:space="0" w:sz="6" w:val="single"/>
             </w:tcBorders>
-            <w:shd w:fill="ffd966" w:val="clear"/>
-            <w:tcMar>
-              <w:top w:w="120.0" w:type="dxa"/>
-              <w:left w:w="180.0" w:type="dxa"/>
-              <w:bottom w:w="120.0" w:type="dxa"/>
-              <w:right w:w="180.0" w:type="dxa"/>
-            </w:tcMar>
-            <w:vAlign w:val="top"/>
-          </w:tcPr>
-          <w:p>
-            <w:pPr>
-              <w:spacing w:line="240" w:lineRule="auto"/>
-              <w:rPr/>
-            </w:pPr>
-            <w:r>
-              <w:rPr>
-                <w:rtl w:val="0"/>
-              </w:rPr>
-              <w:t xml:space="preserve">Pendiente</w:t>
-            </w:r>
-          </w:p>
-        </w:tc>
-        <w:tc>
-          <w:tcPr>
-            <w:tcBorders>
-              <w:top w:color="c4c7c5" w:space="0" w:sz="6" w:val="single"/>
-              <w:left w:color="c4c7c5" w:space="0" w:sz="6" w:val="single"/>
-              <w:bottom w:color="c4c7c5" w:space="0" w:sz="6" w:val="single"/>
-              <w:right w:color="c4c7c5" w:space="0" w:sz="6" w:val="single"/>
-            </w:tcBorders>
-            <w:tcMar>
-              <w:top w:w="120.0" w:type="dxa"/>
-              <w:left w:w="180.0" w:type="dxa"/>
-              <w:bottom w:w="120.0" w:type="dxa"/>
-              <w:right w:w="180.0" w:type="dxa"/>
-            </w:tcMar>
-            <w:vAlign w:val="top"/>
-          </w:tcPr>
-          <w:p>
-            <w:pPr>
-              <w:spacing w:line="240" w:lineRule="auto"/>
-              <w:rPr/>
-            </w:pPr>
-            <w:r>
-              <w:rPr>
-                <w:rtl w:val="0"/>
-              </w:rPr>
+            <w:shd w:fill="93c47d" w:val="clear"/>
+            <w:tcMar>
+              <w:top w:w="120.0" w:type="dxa"/>
+              <w:left w:w="180.0" w:type="dxa"/>
+              <w:bottom w:w="120.0" w:type="dxa"/>
+              <w:right w:w="180.0" w:type="dxa"/>
+            </w:tcMar>
+            <w:vAlign w:val="top"/>
+          </w:tcPr>
+          <w:p>
+            <w:pPr>
+              <w:spacing w:line="240" w:lineRule="auto"/>
+              <w:rPr/>
+            </w:pPr>
+            <w:r>
+              <w:rPr>
+                <w:rtl w:val="0"/>
+              </w:rPr>
+              <w:t xml:space="preserve">Completado</w:t>
+            </w:r>
+          </w:p>
+        </w:tc>
+        <w:tc>
+          <w:tcPr>
+            <w:tcBorders>
+              <w:top w:color="c4c7c5" w:space="0" w:sz="6" w:val="single"/>
+              <w:left w:color="c4c7c5" w:space="0" w:sz="6" w:val="single"/>
+              <w:bottom w:color="c4c7c5" w:space="0" w:sz="6" w:val="single"/>
+              <w:right w:color="c4c7c5" w:space="0" w:sz="6" w:val="single"/>
+            </w:tcBorders>
+            <w:tcMar>
+              <w:top w:w="120.0" w:type="dxa"/>
+              <w:left w:w="180.0" w:type="dxa"/>
+              <w:bottom w:w="120.0" w:type="dxa"/>
+              <w:right w:w="180.0" w:type="dxa"/>
+            </w:tcMar>
+            <w:vAlign w:val="top"/>
+          </w:tcPr>
+          <w:p>
+            <w:pPr>
+              <w:spacing w:line="240" w:lineRule="auto"/>
+              <w:rPr/>
+            </w:pPr>
+            <w:r>
+              <w:rPr>
+                <w:rtl w:val="0"/>
+              </w:rPr>
+              <w:t xml:space="preserve">15-9-2026</w:t>
             </w:r>
           </w:p>
         </w:tc>
@@ -1411,6 +1414,8 @@
                 <w:rtl w:val="0"/>
               </w:rPr>
               <w:t xml:space="preserve">4. Interfaz Gráfica (GUI)</w:t>
+              <w:br w:type="textWrapping"/>
+              <w:t xml:space="preserve">(Consultar historico y trigger de solapamiento)</w:t>
             </w:r>
           </w:p>
         </w:tc>
@@ -1451,53 +1456,54 @@
               <w:bottom w:color="c4c7c5" w:space="0" w:sz="6" w:val="single"/>
               <w:right w:color="c4c7c5" w:space="0" w:sz="6" w:val="single"/>
             </w:tcBorders>
-            <w:shd w:fill="ffd966" w:val="clear"/>
-            <w:tcMar>
-              <w:top w:w="120.0" w:type="dxa"/>
-              <w:left w:w="180.0" w:type="dxa"/>
-              <w:bottom w:w="120.0" w:type="dxa"/>
-              <w:right w:w="180.0" w:type="dxa"/>
-            </w:tcMar>
-            <w:vAlign w:val="top"/>
-          </w:tcPr>
-          <w:p>
-            <w:pPr>
-              <w:spacing w:line="240" w:lineRule="auto"/>
-              <w:rPr/>
-            </w:pPr>
-            <w:r>
-              <w:rPr>
-                <w:rtl w:val="0"/>
-              </w:rPr>
-              <w:t xml:space="preserve">Pendiente</w:t>
-            </w:r>
-          </w:p>
-        </w:tc>
-        <w:tc>
-          <w:tcPr>
-            <w:tcBorders>
-              <w:top w:color="c4c7c5" w:space="0" w:sz="6" w:val="single"/>
-              <w:left w:color="c4c7c5" w:space="0" w:sz="6" w:val="single"/>
-              <w:bottom w:color="c4c7c5" w:space="0" w:sz="6" w:val="single"/>
-              <w:right w:color="c4c7c5" w:space="0" w:sz="6" w:val="single"/>
-            </w:tcBorders>
-            <w:tcMar>
-              <w:top w:w="120.0" w:type="dxa"/>
-              <w:left w:w="180.0" w:type="dxa"/>
-              <w:bottom w:w="120.0" w:type="dxa"/>
-              <w:right w:w="180.0" w:type="dxa"/>
-            </w:tcMar>
-            <w:vAlign w:val="top"/>
-          </w:tcPr>
-          <w:p>
-            <w:pPr>
-              <w:spacing w:line="240" w:lineRule="auto"/>
-              <w:rPr/>
-            </w:pPr>
-            <w:r>
-              <w:rPr>
-                <w:rtl w:val="0"/>
-              </w:rPr>
+            <w:shd w:fill="93c47d" w:val="clear"/>
+            <w:tcMar>
+              <w:top w:w="120.0" w:type="dxa"/>
+              <w:left w:w="180.0" w:type="dxa"/>
+              <w:bottom w:w="120.0" w:type="dxa"/>
+              <w:right w:w="180.0" w:type="dxa"/>
+            </w:tcMar>
+            <w:vAlign w:val="top"/>
+          </w:tcPr>
+          <w:p>
+            <w:pPr>
+              <w:spacing w:line="240" w:lineRule="auto"/>
+              <w:rPr/>
+            </w:pPr>
+            <w:r>
+              <w:rPr>
+                <w:rtl w:val="0"/>
+              </w:rPr>
+              <w:t xml:space="preserve">Completado</w:t>
+            </w:r>
+          </w:p>
+        </w:tc>
+        <w:tc>
+          <w:tcPr>
+            <w:tcBorders>
+              <w:top w:color="c4c7c5" w:space="0" w:sz="6" w:val="single"/>
+              <w:left w:color="c4c7c5" w:space="0" w:sz="6" w:val="single"/>
+              <w:bottom w:color="c4c7c5" w:space="0" w:sz="6" w:val="single"/>
+              <w:right w:color="c4c7c5" w:space="0" w:sz="6" w:val="single"/>
+            </w:tcBorders>
+            <w:tcMar>
+              <w:top w:w="120.0" w:type="dxa"/>
+              <w:left w:w="180.0" w:type="dxa"/>
+              <w:bottom w:w="120.0" w:type="dxa"/>
+              <w:right w:w="180.0" w:type="dxa"/>
+            </w:tcMar>
+            <w:vAlign w:val="top"/>
+          </w:tcPr>
+          <w:p>
+            <w:pPr>
+              <w:spacing w:line="240" w:lineRule="auto"/>
+              <w:rPr/>
+            </w:pPr>
+            <w:r>
+              <w:rPr>
+                <w:rtl w:val="0"/>
+              </w:rPr>
+              <w:t xml:space="preserve">15-9-2026</w:t>
             </w:r>
           </w:p>
         </w:tc>
@@ -1533,7 +1539,7 @@
               <w:rPr>
                 <w:rtl w:val="0"/>
               </w:rPr>
-              <w:t xml:space="preserve">RF-10</w:t>
+              <w:t xml:space="preserve">RF-10 (Ranking)</w:t>
             </w:r>
           </w:p>
           <w:p>
@@ -1778,53 +1784,54 @@
               <w:bottom w:color="c4c7c5" w:space="0" w:sz="6" w:val="single"/>
               <w:right w:color="c4c7c5" w:space="0" w:sz="6" w:val="single"/>
             </w:tcBorders>
-            <w:shd w:fill="ffd966" w:val="clear"/>
-            <w:tcMar>
-              <w:top w:w="120.0" w:type="dxa"/>
-              <w:left w:w="180.0" w:type="dxa"/>
-              <w:bottom w:w="120.0" w:type="dxa"/>
-              <w:right w:w="180.0" w:type="dxa"/>
-            </w:tcMar>
-            <w:vAlign w:val="top"/>
-          </w:tcPr>
-          <w:p>
-            <w:pPr>
-              <w:spacing w:line="240" w:lineRule="auto"/>
-              <w:rPr/>
-            </w:pPr>
-            <w:r>
-              <w:rPr>
-                <w:rtl w:val="0"/>
-              </w:rPr>
-              <w:t xml:space="preserve">Pendiente</w:t>
-            </w:r>
-          </w:p>
-        </w:tc>
-        <w:tc>
-          <w:tcPr>
-            <w:tcBorders>
-              <w:top w:color="c4c7c5" w:space="0" w:sz="6" w:val="single"/>
-              <w:left w:color="c4c7c5" w:space="0" w:sz="6" w:val="single"/>
-              <w:bottom w:color="c4c7c5" w:space="0" w:sz="6" w:val="single"/>
-              <w:right w:color="c4c7c5" w:space="0" w:sz="6" w:val="single"/>
-            </w:tcBorders>
-            <w:tcMar>
-              <w:top w:w="120.0" w:type="dxa"/>
-              <w:left w:w="180.0" w:type="dxa"/>
-              <w:bottom w:w="120.0" w:type="dxa"/>
-              <w:right w:w="180.0" w:type="dxa"/>
-            </w:tcMar>
-            <w:vAlign w:val="top"/>
-          </w:tcPr>
-          <w:p>
-            <w:pPr>
-              <w:spacing w:line="240" w:lineRule="auto"/>
-              <w:rPr/>
-            </w:pPr>
-            <w:r>
-              <w:rPr>
-                <w:rtl w:val="0"/>
-              </w:rPr>
+            <w:shd w:fill="93c47d" w:val="clear"/>
+            <w:tcMar>
+              <w:top w:w="120.0" w:type="dxa"/>
+              <w:left w:w="180.0" w:type="dxa"/>
+              <w:bottom w:w="120.0" w:type="dxa"/>
+              <w:right w:w="180.0" w:type="dxa"/>
+            </w:tcMar>
+            <w:vAlign w:val="top"/>
+          </w:tcPr>
+          <w:p>
+            <w:pPr>
+              <w:spacing w:line="240" w:lineRule="auto"/>
+              <w:rPr/>
+            </w:pPr>
+            <w:r>
+              <w:rPr>
+                <w:rtl w:val="0"/>
+              </w:rPr>
+              <w:t xml:space="preserve">Completado</w:t>
+            </w:r>
+          </w:p>
+        </w:tc>
+        <w:tc>
+          <w:tcPr>
+            <w:tcBorders>
+              <w:top w:color="c4c7c5" w:space="0" w:sz="6" w:val="single"/>
+              <w:left w:color="c4c7c5" w:space="0" w:sz="6" w:val="single"/>
+              <w:bottom w:color="c4c7c5" w:space="0" w:sz="6" w:val="single"/>
+              <w:right w:color="c4c7c5" w:space="0" w:sz="6" w:val="single"/>
+            </w:tcBorders>
+            <w:tcMar>
+              <w:top w:w="120.0" w:type="dxa"/>
+              <w:left w:w="180.0" w:type="dxa"/>
+              <w:bottom w:w="120.0" w:type="dxa"/>
+              <w:right w:w="180.0" w:type="dxa"/>
+            </w:tcMar>
+            <w:vAlign w:val="top"/>
+          </w:tcPr>
+          <w:p>
+            <w:pPr>
+              <w:spacing w:line="240" w:lineRule="auto"/>
+              <w:rPr/>
+            </w:pPr>
+            <w:r>
+              <w:rPr>
+                <w:rtl w:val="0"/>
+              </w:rPr>
+              <w:t xml:space="preserve">15-9-2026</w:t>
             </w:r>
           </w:p>
         </w:tc>

</xml_diff>

<commit_message>
Documentacion de todas las interfaces GUI terminada
</commit_message>
<xml_diff>
--- a/Docs/Matriz de trazabilidad.docx
+++ b/Docs/Matriz de trazabilidad.docx
@@ -2675,53 +2675,54 @@
               <w:bottom w:color="c4c7c5" w:space="0" w:sz="6" w:val="single"/>
               <w:right w:color="c4c7c5" w:space="0" w:sz="6" w:val="single"/>
             </w:tcBorders>
-            <w:shd w:fill="ffd966" w:val="clear"/>
-            <w:tcMar>
-              <w:top w:w="120.0" w:type="dxa"/>
-              <w:left w:w="180.0" w:type="dxa"/>
-              <w:bottom w:w="120.0" w:type="dxa"/>
-              <w:right w:w="180.0" w:type="dxa"/>
-            </w:tcMar>
-            <w:vAlign w:val="top"/>
-          </w:tcPr>
-          <w:p>
-            <w:pPr>
-              <w:spacing w:line="240" w:lineRule="auto"/>
-              <w:rPr/>
-            </w:pPr>
-            <w:r>
-              <w:rPr>
-                <w:rtl w:val="0"/>
-              </w:rPr>
-              <w:t xml:space="preserve">Pendiente</w:t>
-            </w:r>
-          </w:p>
-        </w:tc>
-        <w:tc>
-          <w:tcPr>
-            <w:tcBorders>
-              <w:top w:color="c4c7c5" w:space="0" w:sz="6" w:val="single"/>
-              <w:left w:color="c4c7c5" w:space="0" w:sz="6" w:val="single"/>
-              <w:bottom w:color="c4c7c5" w:space="0" w:sz="6" w:val="single"/>
-              <w:right w:color="c4c7c5" w:space="0" w:sz="6" w:val="single"/>
-            </w:tcBorders>
-            <w:tcMar>
-              <w:top w:w="120.0" w:type="dxa"/>
-              <w:left w:w="180.0" w:type="dxa"/>
-              <w:bottom w:w="120.0" w:type="dxa"/>
-              <w:right w:w="180.0" w:type="dxa"/>
-            </w:tcMar>
-            <w:vAlign w:val="top"/>
-          </w:tcPr>
-          <w:p>
-            <w:pPr>
-              <w:spacing w:line="240" w:lineRule="auto"/>
-              <w:rPr/>
-            </w:pPr>
-            <w:r>
-              <w:rPr>
-                <w:rtl w:val="0"/>
-              </w:rPr>
+            <w:shd w:fill="93c47d" w:val="clear"/>
+            <w:tcMar>
+              <w:top w:w="120.0" w:type="dxa"/>
+              <w:left w:w="180.0" w:type="dxa"/>
+              <w:bottom w:w="120.0" w:type="dxa"/>
+              <w:right w:w="180.0" w:type="dxa"/>
+            </w:tcMar>
+            <w:vAlign w:val="top"/>
+          </w:tcPr>
+          <w:p>
+            <w:pPr>
+              <w:spacing w:line="240" w:lineRule="auto"/>
+              <w:rPr/>
+            </w:pPr>
+            <w:r>
+              <w:rPr>
+                <w:rtl w:val="0"/>
+              </w:rPr>
+              <w:t xml:space="preserve">Completado</w:t>
+            </w:r>
+          </w:p>
+        </w:tc>
+        <w:tc>
+          <w:tcPr>
+            <w:tcBorders>
+              <w:top w:color="c4c7c5" w:space="0" w:sz="6" w:val="single"/>
+              <w:left w:color="c4c7c5" w:space="0" w:sz="6" w:val="single"/>
+              <w:bottom w:color="c4c7c5" w:space="0" w:sz="6" w:val="single"/>
+              <w:right w:color="c4c7c5" w:space="0" w:sz="6" w:val="single"/>
+            </w:tcBorders>
+            <w:tcMar>
+              <w:top w:w="120.0" w:type="dxa"/>
+              <w:left w:w="180.0" w:type="dxa"/>
+              <w:bottom w:w="120.0" w:type="dxa"/>
+              <w:right w:w="180.0" w:type="dxa"/>
+            </w:tcMar>
+            <w:vAlign w:val="top"/>
+          </w:tcPr>
+          <w:p>
+            <w:pPr>
+              <w:spacing w:line="240" w:lineRule="auto"/>
+              <w:rPr/>
+            </w:pPr>
+            <w:r>
+              <w:rPr>
+                <w:rtl w:val="0"/>
+              </w:rPr>
+              <w:t xml:space="preserve">15-9-2026</w:t>
             </w:r>
           </w:p>
         </w:tc>
@@ -3017,53 +3018,54 @@
               <w:bottom w:color="c4c7c5" w:space="0" w:sz="6" w:val="single"/>
               <w:right w:color="c4c7c5" w:space="0" w:sz="6" w:val="single"/>
             </w:tcBorders>
-            <w:shd w:fill="ffd966" w:val="clear"/>
-            <w:tcMar>
-              <w:top w:w="120.0" w:type="dxa"/>
-              <w:left w:w="180.0" w:type="dxa"/>
-              <w:bottom w:w="120.0" w:type="dxa"/>
-              <w:right w:w="180.0" w:type="dxa"/>
-            </w:tcMar>
-            <w:vAlign w:val="top"/>
-          </w:tcPr>
-          <w:p>
-            <w:pPr>
-              <w:spacing w:line="240" w:lineRule="auto"/>
-              <w:rPr/>
-            </w:pPr>
-            <w:r>
-              <w:rPr>
-                <w:rtl w:val="0"/>
-              </w:rPr>
-              <w:t xml:space="preserve">Pendiente</w:t>
-            </w:r>
-          </w:p>
-        </w:tc>
-        <w:tc>
-          <w:tcPr>
-            <w:tcBorders>
-              <w:top w:color="c4c7c5" w:space="0" w:sz="6" w:val="single"/>
-              <w:left w:color="c4c7c5" w:space="0" w:sz="6" w:val="single"/>
-              <w:bottom w:color="c4c7c5" w:space="0" w:sz="6" w:val="single"/>
-              <w:right w:color="c4c7c5" w:space="0" w:sz="6" w:val="single"/>
-            </w:tcBorders>
-            <w:tcMar>
-              <w:top w:w="120.0" w:type="dxa"/>
-              <w:left w:w="180.0" w:type="dxa"/>
-              <w:bottom w:w="120.0" w:type="dxa"/>
-              <w:right w:w="180.0" w:type="dxa"/>
-            </w:tcMar>
-            <w:vAlign w:val="top"/>
-          </w:tcPr>
-          <w:p>
-            <w:pPr>
-              <w:spacing w:line="240" w:lineRule="auto"/>
-              <w:rPr/>
-            </w:pPr>
-            <w:r>
-              <w:rPr>
-                <w:rtl w:val="0"/>
-              </w:rPr>
+            <w:shd w:fill="93c47d" w:val="clear"/>
+            <w:tcMar>
+              <w:top w:w="120.0" w:type="dxa"/>
+              <w:left w:w="180.0" w:type="dxa"/>
+              <w:bottom w:w="120.0" w:type="dxa"/>
+              <w:right w:w="180.0" w:type="dxa"/>
+            </w:tcMar>
+            <w:vAlign w:val="top"/>
+          </w:tcPr>
+          <w:p>
+            <w:pPr>
+              <w:spacing w:line="240" w:lineRule="auto"/>
+              <w:rPr/>
+            </w:pPr>
+            <w:r>
+              <w:rPr>
+                <w:rtl w:val="0"/>
+              </w:rPr>
+              <w:t xml:space="preserve">Completado</w:t>
+            </w:r>
+          </w:p>
+        </w:tc>
+        <w:tc>
+          <w:tcPr>
+            <w:tcBorders>
+              <w:top w:color="c4c7c5" w:space="0" w:sz="6" w:val="single"/>
+              <w:left w:color="c4c7c5" w:space="0" w:sz="6" w:val="single"/>
+              <w:bottom w:color="c4c7c5" w:space="0" w:sz="6" w:val="single"/>
+              <w:right w:color="c4c7c5" w:space="0" w:sz="6" w:val="single"/>
+            </w:tcBorders>
+            <w:tcMar>
+              <w:top w:w="120.0" w:type="dxa"/>
+              <w:left w:w="180.0" w:type="dxa"/>
+              <w:bottom w:w="120.0" w:type="dxa"/>
+              <w:right w:w="180.0" w:type="dxa"/>
+            </w:tcMar>
+            <w:vAlign w:val="top"/>
+          </w:tcPr>
+          <w:p>
+            <w:pPr>
+              <w:spacing w:line="240" w:lineRule="auto"/>
+              <w:rPr/>
+            </w:pPr>
+            <w:r>
+              <w:rPr>
+                <w:rtl w:val="0"/>
+              </w:rPr>
+              <w:t xml:space="preserve">15-9-2026</w:t>
             </w:r>
           </w:p>
         </w:tc>
@@ -3959,53 +3961,54 @@
               <w:bottom w:color="c4c7c5" w:space="0" w:sz="6" w:val="single"/>
               <w:right w:color="c4c7c5" w:space="0" w:sz="6" w:val="single"/>
             </w:tcBorders>
-            <w:shd w:fill="ffd966" w:val="clear"/>
-            <w:tcMar>
-              <w:top w:w="120.0" w:type="dxa"/>
-              <w:left w:w="180.0" w:type="dxa"/>
-              <w:bottom w:w="120.0" w:type="dxa"/>
-              <w:right w:w="180.0" w:type="dxa"/>
-            </w:tcMar>
-            <w:vAlign w:val="top"/>
-          </w:tcPr>
-          <w:p>
-            <w:pPr>
-              <w:spacing w:line="240" w:lineRule="auto"/>
-              <w:rPr/>
-            </w:pPr>
-            <w:r>
-              <w:rPr>
-                <w:rtl w:val="0"/>
-              </w:rPr>
-              <w:t xml:space="preserve">Pendiente</w:t>
-            </w:r>
-          </w:p>
-        </w:tc>
-        <w:tc>
-          <w:tcPr>
-            <w:tcBorders>
-              <w:top w:color="c4c7c5" w:space="0" w:sz="6" w:val="single"/>
-              <w:left w:color="c4c7c5" w:space="0" w:sz="6" w:val="single"/>
-              <w:bottom w:color="c4c7c5" w:space="0" w:sz="6" w:val="single"/>
-              <w:right w:color="c4c7c5" w:space="0" w:sz="6" w:val="single"/>
-            </w:tcBorders>
-            <w:tcMar>
-              <w:top w:w="120.0" w:type="dxa"/>
-              <w:left w:w="180.0" w:type="dxa"/>
-              <w:bottom w:w="120.0" w:type="dxa"/>
-              <w:right w:w="180.0" w:type="dxa"/>
-            </w:tcMar>
-            <w:vAlign w:val="top"/>
-          </w:tcPr>
-          <w:p>
-            <w:pPr>
-              <w:spacing w:line="240" w:lineRule="auto"/>
-              <w:rPr/>
-            </w:pPr>
-            <w:r>
-              <w:rPr>
-                <w:rtl w:val="0"/>
-              </w:rPr>
+            <w:shd w:fill="93c47d" w:val="clear"/>
+            <w:tcMar>
+              <w:top w:w="120.0" w:type="dxa"/>
+              <w:left w:w="180.0" w:type="dxa"/>
+              <w:bottom w:w="120.0" w:type="dxa"/>
+              <w:right w:w="180.0" w:type="dxa"/>
+            </w:tcMar>
+            <w:vAlign w:val="top"/>
+          </w:tcPr>
+          <w:p>
+            <w:pPr>
+              <w:spacing w:line="240" w:lineRule="auto"/>
+              <w:rPr/>
+            </w:pPr>
+            <w:r>
+              <w:rPr>
+                <w:rtl w:val="0"/>
+              </w:rPr>
+              <w:t xml:space="preserve">Completado</w:t>
+            </w:r>
+          </w:p>
+        </w:tc>
+        <w:tc>
+          <w:tcPr>
+            <w:tcBorders>
+              <w:top w:color="c4c7c5" w:space="0" w:sz="6" w:val="single"/>
+              <w:left w:color="c4c7c5" w:space="0" w:sz="6" w:val="single"/>
+              <w:bottom w:color="c4c7c5" w:space="0" w:sz="6" w:val="single"/>
+              <w:right w:color="c4c7c5" w:space="0" w:sz="6" w:val="single"/>
+            </w:tcBorders>
+            <w:tcMar>
+              <w:top w:w="120.0" w:type="dxa"/>
+              <w:left w:w="180.0" w:type="dxa"/>
+              <w:bottom w:w="120.0" w:type="dxa"/>
+              <w:right w:w="180.0" w:type="dxa"/>
+            </w:tcMar>
+            <w:vAlign w:val="top"/>
+          </w:tcPr>
+          <w:p>
+            <w:pPr>
+              <w:spacing w:line="240" w:lineRule="auto"/>
+              <w:rPr/>
+            </w:pPr>
+            <w:r>
+              <w:rPr>
+                <w:rtl w:val="0"/>
+              </w:rPr>
+              <w:t xml:space="preserve">15-9-2026 4:16pm</w:t>
             </w:r>
           </w:p>
         </w:tc>
@@ -4096,6 +4099,29 @@
               <w:t xml:space="preserve">3. Modelo Físico</w:t>
             </w:r>
           </w:p>
+          <w:p>
+            <w:pPr>
+              <w:spacing w:line="240" w:lineRule="auto"/>
+              <w:rPr/>
+            </w:pPr>
+            <w:r>
+              <w:rPr>
+                <w:rtl w:val="0"/>
+              </w:rPr>
+            </w:r>
+          </w:p>
+          <w:p>
+            <w:pPr>
+              <w:spacing w:line="240" w:lineRule="auto"/>
+              <w:rPr/>
+            </w:pPr>
+            <w:r>
+              <w:rPr>
+                <w:rtl w:val="0"/>
+              </w:rPr>
+              <w:t xml:space="preserve">(tareas pendientes)</w:t>
+            </w:r>
+          </w:p>
         </w:tc>
         <w:tc>
           <w:tcPr>
@@ -4287,53 +4313,54 @@
               <w:bottom w:color="c4c7c5" w:space="0" w:sz="6" w:val="single"/>
               <w:right w:color="c4c7c5" w:space="0" w:sz="6" w:val="single"/>
             </w:tcBorders>
-            <w:shd w:fill="ffd966" w:val="clear"/>
-            <w:tcMar>
-              <w:top w:w="120.0" w:type="dxa"/>
-              <w:left w:w="180.0" w:type="dxa"/>
-              <w:bottom w:w="120.0" w:type="dxa"/>
-              <w:right w:w="180.0" w:type="dxa"/>
-            </w:tcMar>
-            <w:vAlign w:val="top"/>
-          </w:tcPr>
-          <w:p>
-            <w:pPr>
-              <w:spacing w:line="240" w:lineRule="auto"/>
-              <w:rPr/>
-            </w:pPr>
-            <w:r>
-              <w:rPr>
-                <w:rtl w:val="0"/>
-              </w:rPr>
-              <w:t xml:space="preserve">Pendiente</w:t>
-            </w:r>
-          </w:p>
-        </w:tc>
-        <w:tc>
-          <w:tcPr>
-            <w:tcBorders>
-              <w:top w:color="c4c7c5" w:space="0" w:sz="6" w:val="single"/>
-              <w:left w:color="c4c7c5" w:space="0" w:sz="6" w:val="single"/>
-              <w:bottom w:color="c4c7c5" w:space="0" w:sz="6" w:val="single"/>
-              <w:right w:color="c4c7c5" w:space="0" w:sz="6" w:val="single"/>
-            </w:tcBorders>
-            <w:tcMar>
-              <w:top w:w="120.0" w:type="dxa"/>
-              <w:left w:w="180.0" w:type="dxa"/>
-              <w:bottom w:w="120.0" w:type="dxa"/>
-              <w:right w:w="180.0" w:type="dxa"/>
-            </w:tcMar>
-            <w:vAlign w:val="top"/>
-          </w:tcPr>
-          <w:p>
-            <w:pPr>
-              <w:spacing w:line="240" w:lineRule="auto"/>
-              <w:rPr/>
-            </w:pPr>
-            <w:r>
-              <w:rPr>
-                <w:rtl w:val="0"/>
-              </w:rPr>
+            <w:shd w:fill="93c47d" w:val="clear"/>
+            <w:tcMar>
+              <w:top w:w="120.0" w:type="dxa"/>
+              <w:left w:w="180.0" w:type="dxa"/>
+              <w:bottom w:w="120.0" w:type="dxa"/>
+              <w:right w:w="180.0" w:type="dxa"/>
+            </w:tcMar>
+            <w:vAlign w:val="top"/>
+          </w:tcPr>
+          <w:p>
+            <w:pPr>
+              <w:spacing w:line="240" w:lineRule="auto"/>
+              <w:rPr/>
+            </w:pPr>
+            <w:r>
+              <w:rPr>
+                <w:rtl w:val="0"/>
+              </w:rPr>
+              <w:t xml:space="preserve">Completado</w:t>
+            </w:r>
+          </w:p>
+        </w:tc>
+        <w:tc>
+          <w:tcPr>
+            <w:tcBorders>
+              <w:top w:color="c4c7c5" w:space="0" w:sz="6" w:val="single"/>
+              <w:left w:color="c4c7c5" w:space="0" w:sz="6" w:val="single"/>
+              <w:bottom w:color="c4c7c5" w:space="0" w:sz="6" w:val="single"/>
+              <w:right w:color="c4c7c5" w:space="0" w:sz="6" w:val="single"/>
+            </w:tcBorders>
+            <w:tcMar>
+              <w:top w:w="120.0" w:type="dxa"/>
+              <w:left w:w="180.0" w:type="dxa"/>
+              <w:bottom w:w="120.0" w:type="dxa"/>
+              <w:right w:w="180.0" w:type="dxa"/>
+            </w:tcMar>
+            <w:vAlign w:val="top"/>
+          </w:tcPr>
+          <w:p>
+            <w:pPr>
+              <w:spacing w:line="240" w:lineRule="auto"/>
+              <w:rPr/>
+            </w:pPr>
+            <w:r>
+              <w:rPr>
+                <w:rtl w:val="0"/>
+              </w:rPr>
+              <w:t xml:space="preserve">15-9-2026</w:t>
             </w:r>
           </w:p>
         </w:tc>
@@ -4424,6 +4451,29 @@
               <w:t xml:space="preserve">3. Modelo Físico</w:t>
             </w:r>
           </w:p>
+          <w:p>
+            <w:pPr>
+              <w:spacing w:line="240" w:lineRule="auto"/>
+              <w:rPr/>
+            </w:pPr>
+            <w:r>
+              <w:rPr>
+                <w:rtl w:val="0"/>
+              </w:rPr>
+            </w:r>
+          </w:p>
+          <w:p>
+            <w:pPr>
+              <w:spacing w:line="240" w:lineRule="auto"/>
+              <w:rPr/>
+            </w:pPr>
+            <w:r>
+              <w:rPr>
+                <w:rtl w:val="0"/>
+              </w:rPr>
+              <w:t xml:space="preserve">(tareas vencidas)</w:t>
+            </w:r>
+          </w:p>
         </w:tc>
         <w:tc>
           <w:tcPr>
@@ -4576,6 +4626,17 @@
               <w:t xml:space="preserve">4. Interfaz Gráfica (GUI)</w:t>
             </w:r>
           </w:p>
+          <w:p>
+            <w:pPr>
+              <w:spacing w:line="240" w:lineRule="auto"/>
+              <w:rPr/>
+            </w:pPr>
+            <w:r>
+              <w:rPr>
+                <w:rtl w:val="0"/>
+              </w:rPr>
+            </w:r>
+          </w:p>
         </w:tc>
         <w:tc>
           <w:tcPr>
@@ -4614,53 +4675,54 @@
               <w:bottom w:color="c4c7c5" w:space="0" w:sz="6" w:val="single"/>
               <w:right w:color="c4c7c5" w:space="0" w:sz="6" w:val="single"/>
             </w:tcBorders>
-            <w:shd w:fill="ffd966" w:val="clear"/>
-            <w:tcMar>
-              <w:top w:w="120.0" w:type="dxa"/>
-              <w:left w:w="180.0" w:type="dxa"/>
-              <w:bottom w:w="120.0" w:type="dxa"/>
-              <w:right w:w="180.0" w:type="dxa"/>
-            </w:tcMar>
-            <w:vAlign w:val="top"/>
-          </w:tcPr>
-          <w:p>
-            <w:pPr>
-              <w:spacing w:line="240" w:lineRule="auto"/>
-              <w:rPr/>
-            </w:pPr>
-            <w:r>
-              <w:rPr>
-                <w:rtl w:val="0"/>
-              </w:rPr>
-              <w:t xml:space="preserve">Pendiente</w:t>
-            </w:r>
-          </w:p>
-        </w:tc>
-        <w:tc>
-          <w:tcPr>
-            <w:tcBorders>
-              <w:top w:color="c4c7c5" w:space="0" w:sz="6" w:val="single"/>
-              <w:left w:color="c4c7c5" w:space="0" w:sz="6" w:val="single"/>
-              <w:bottom w:color="c4c7c5" w:space="0" w:sz="6" w:val="single"/>
-              <w:right w:color="c4c7c5" w:space="0" w:sz="6" w:val="single"/>
-            </w:tcBorders>
-            <w:tcMar>
-              <w:top w:w="120.0" w:type="dxa"/>
-              <w:left w:w="180.0" w:type="dxa"/>
-              <w:bottom w:w="120.0" w:type="dxa"/>
-              <w:right w:w="180.0" w:type="dxa"/>
-            </w:tcMar>
-            <w:vAlign w:val="top"/>
-          </w:tcPr>
-          <w:p>
-            <w:pPr>
-              <w:spacing w:line="240" w:lineRule="auto"/>
-              <w:rPr/>
-            </w:pPr>
-            <w:r>
-              <w:rPr>
-                <w:rtl w:val="0"/>
-              </w:rPr>
+            <w:shd w:fill="93c47d" w:val="clear"/>
+            <w:tcMar>
+              <w:top w:w="120.0" w:type="dxa"/>
+              <w:left w:w="180.0" w:type="dxa"/>
+              <w:bottom w:w="120.0" w:type="dxa"/>
+              <w:right w:w="180.0" w:type="dxa"/>
+            </w:tcMar>
+            <w:vAlign w:val="top"/>
+          </w:tcPr>
+          <w:p>
+            <w:pPr>
+              <w:spacing w:line="240" w:lineRule="auto"/>
+              <w:rPr/>
+            </w:pPr>
+            <w:r>
+              <w:rPr>
+                <w:rtl w:val="0"/>
+              </w:rPr>
+              <w:t xml:space="preserve">Completado</w:t>
+            </w:r>
+          </w:p>
+        </w:tc>
+        <w:tc>
+          <w:tcPr>
+            <w:tcBorders>
+              <w:top w:color="c4c7c5" w:space="0" w:sz="6" w:val="single"/>
+              <w:left w:color="c4c7c5" w:space="0" w:sz="6" w:val="single"/>
+              <w:bottom w:color="c4c7c5" w:space="0" w:sz="6" w:val="single"/>
+              <w:right w:color="c4c7c5" w:space="0" w:sz="6" w:val="single"/>
+            </w:tcBorders>
+            <w:tcMar>
+              <w:top w:w="120.0" w:type="dxa"/>
+              <w:left w:w="180.0" w:type="dxa"/>
+              <w:bottom w:w="120.0" w:type="dxa"/>
+              <w:right w:w="180.0" w:type="dxa"/>
+            </w:tcMar>
+            <w:vAlign w:val="top"/>
+          </w:tcPr>
+          <w:p>
+            <w:pPr>
+              <w:spacing w:line="240" w:lineRule="auto"/>
+              <w:rPr/>
+            </w:pPr>
+            <w:r>
+              <w:rPr>
+                <w:rtl w:val="0"/>
+              </w:rPr>
+              <w:t xml:space="preserve">15-9-2026</w:t>
             </w:r>
           </w:p>
         </w:tc>

</xml_diff>